<commit_message>
feladat és adathalmaz leírás
</commit_message>
<xml_diff>
--- a/Documentation/doksi.docx
+++ b/Documentation/doksi.docx
@@ -1,6 +1,6 @@
 
 <file path=word/document.xml><?xml version="1.0" encoding="utf-8"?>
-<w:document xmlns:wpc="http://schemas.microsoft.com/office/word/2010/wordprocessingCanvas" xmlns:cx="http://schemas.microsoft.com/office/drawing/2014/chartex" xmlns:cx1="http://schemas.microsoft.com/office/drawing/2015/9/8/chartex" xmlns:cx2="http://schemas.microsoft.com/office/drawing/2015/10/21/chartex" xmlns:cx3="http://schemas.microsoft.com/office/drawing/2016/5/9/chartex" xmlns:cx4="http://schemas.microsoft.com/office/drawing/2016/5/10/chartex" xmlns:cx5="http://schemas.microsoft.com/office/drawing/2016/5/11/chartex" xmlns:cx6="http://schemas.microsoft.com/office/drawing/2016/5/12/chartex" xmlns:cx7="http://schemas.microsoft.com/office/drawing/2016/5/13/chartex" xmlns:cx8="http://schemas.microsoft.com/office/drawing/2016/5/14/chartex" xmlns:mc="http://schemas.openxmlformats.org/markup-compatibility/2006" xmlns:aink="http://schemas.microsoft.com/office/drawing/2016/ink" xmlns:am3d="http://schemas.microsoft.com/office/drawing/2017/model3d" xmlns:o="urn:schemas-microsoft-com:office:office" xmlns:oel="http://schemas.microsoft.com/office/2019/extlst" xmlns:r="http://schemas.openxmlformats.org/officeDocument/2006/relationships" xmlns:m="http://schemas.openxmlformats.org/officeDocument/2006/math" xmlns:v="urn:schemas-microsoft-com:vml" xmlns:wp14="http://schemas.microsoft.com/office/word/2010/wordprocessingDrawing" xmlns:wp="http://schemas.openxmlformats.org/drawingml/2006/wordprocessingDrawing" xmlns:w10="urn:schemas-microsoft-com:office:word" xmlns:w="http://schemas.openxmlformats.org/wordprocessingml/2006/main" xmlns:w14="http://schemas.microsoft.com/office/word/2010/wordml" xmlns:w15="http://schemas.microsoft.com/office/word/2012/wordml" xmlns:w16cex="http://schemas.microsoft.com/office/word/2018/wordml/cex" xmlns:w16cid="http://schemas.microsoft.com/office/word/2016/wordml/cid" xmlns:w16="http://schemas.microsoft.com/office/word/2018/wordml" xmlns:w16du="http://schemas.microsoft.com/office/word/2023/wordml/word16du" xmlns:w16sdtdh="http://schemas.microsoft.com/office/word/2020/wordml/sdtdatahash" xmlns:w16sdtfl="http://schemas.microsoft.com/office/word/2024/wordml/sdtformatlock" xmlns:w16se="http://schemas.microsoft.com/office/word/2015/wordml/symex" xmlns:wpg="http://schemas.microsoft.com/office/word/2010/wordprocessingGroup" xmlns:wpi="http://schemas.microsoft.com/office/word/2010/wordprocessingInk" xmlns:wne="http://schemas.microsoft.com/office/word/2006/wordml" xmlns:wps="http://schemas.microsoft.com/office/word/2010/wordprocessingShape" xmlns:a="http://schemas.openxmlformats.org/drawingml/2006/main" xmlns:pic="http://schemas.openxmlformats.org/drawingml/2006/picture" xmlns:a14="http://schemas.microsoft.com/office/drawing/2010/main" mc:Ignorable="w14 w15 w16se w16cid w16 w16cex w16sdtdh w16sdtfl w16du wp14">
+<w:document xmlns:wpc="http://schemas.microsoft.com/office/word/2010/wordprocessingCanvas" xmlns:cx="http://schemas.microsoft.com/office/drawing/2014/chartex" xmlns:cx1="http://schemas.microsoft.com/office/drawing/2015/9/8/chartex" xmlns:cx2="http://schemas.microsoft.com/office/drawing/2015/10/21/chartex" xmlns:cx3="http://schemas.microsoft.com/office/drawing/2016/5/9/chartex" xmlns:cx4="http://schemas.microsoft.com/office/drawing/2016/5/10/chartex" xmlns:cx5="http://schemas.microsoft.com/office/drawing/2016/5/11/chartex" xmlns:cx6="http://schemas.microsoft.com/office/drawing/2016/5/12/chartex" xmlns:cx7="http://schemas.microsoft.com/office/drawing/2016/5/13/chartex" xmlns:cx8="http://schemas.microsoft.com/office/drawing/2016/5/14/chartex" xmlns:mc="http://schemas.openxmlformats.org/markup-compatibility/2006" xmlns:aink="http://schemas.microsoft.com/office/drawing/2016/ink" xmlns:am3d="http://schemas.microsoft.com/office/drawing/2017/model3d" xmlns:o="urn:schemas-microsoft-com:office:office" xmlns:oel="http://schemas.microsoft.com/office/2019/extlst" xmlns:r="http://schemas.openxmlformats.org/officeDocument/2006/relationships" xmlns:m="http://schemas.openxmlformats.org/officeDocument/2006/math" xmlns:v="urn:schemas-microsoft-com:vml" xmlns:wp14="http://schemas.microsoft.com/office/word/2010/wordprocessingDrawing" xmlns:wp="http://schemas.openxmlformats.org/drawingml/2006/wordprocessingDrawing" xmlns:w10="urn:schemas-microsoft-com:office:word" xmlns:w="http://schemas.openxmlformats.org/wordprocessingml/2006/main" xmlns:w14="http://schemas.microsoft.com/office/word/2010/wordml" xmlns:w15="http://schemas.microsoft.com/office/word/2012/wordml" xmlns:w16cex="http://schemas.microsoft.com/office/word/2018/wordml/cex" xmlns:w16cid="http://schemas.microsoft.com/office/word/2016/wordml/cid" xmlns:w16="http://schemas.microsoft.com/office/word/2018/wordml" xmlns:w16du="http://schemas.microsoft.com/office/word/2023/wordml/word16du" xmlns:w16sdtdh="http://schemas.microsoft.com/office/word/2020/wordml/sdtdatahash" xmlns:w16sdtfl="http://schemas.microsoft.com/office/word/2024/wordml/sdtformatlock" xmlns:w16se="http://schemas.microsoft.com/office/word/2015/wordml/symex" xmlns:wpg="http://schemas.microsoft.com/office/word/2010/wordprocessingGroup" xmlns:wpi="http://schemas.microsoft.com/office/word/2010/wordprocessingInk" xmlns:wne="http://schemas.microsoft.com/office/word/2006/wordml" xmlns:wps="http://schemas.microsoft.com/office/word/2010/wordprocessingShape" mc:Ignorable="w14 w15 w16se w16cid w16 w16cex w16sdtdh w16sdtfl w16du wp14">
   <w:body>
     <w:p/>
     <w:p/>
@@ -13,65 +13,20 @@
         <w:pStyle w:val="Heading1"/>
         <w:jc w:val="center"/>
         <w:rPr>
-          <w:b w:val="1"/>
-          <w:bCs w:val="1"/>
+          <w:b/>
+          <w:bCs/>
           <w:sz w:val="56"/>
           <w:szCs w:val="56"/>
         </w:rPr>
       </w:pPr>
       <w:r>
         <w:rPr>
-          <w:b w:val="1"/>
-          <w:bCs w:val="1"/>
+          <w:b/>
+          <w:bCs/>
           <w:sz w:val="56"/>
           <w:szCs w:val="56"/>
         </w:rPr>
-        <w:t>Szorgalmi</w:t>
-      </w:r>
-      <w:r>
-        <w:rPr>
-          <w:b w:val="1"/>
-          <w:bCs w:val="1"/>
-          <w:sz w:val="56"/>
-          <w:szCs w:val="56"/>
-        </w:rPr>
-        <w:t xml:space="preserve"> </w:t>
-      </w:r>
-      <w:r>
-        <w:rPr>
-          <w:b w:val="1"/>
-          <w:bCs w:val="1"/>
-          <w:sz w:val="56"/>
-          <w:szCs w:val="56"/>
-        </w:rPr>
-        <w:t>nagyházi</w:t>
-      </w:r>
-      <w:r>
-        <w:rPr>
-          <w:b w:val="1"/>
-          <w:bCs w:val="1"/>
-          <w:sz w:val="56"/>
-          <w:szCs w:val="56"/>
-        </w:rPr>
-        <w:t xml:space="preserve"> </w:t>
-      </w:r>
-      <w:r>
-        <w:rPr>
-          <w:b w:val="1"/>
-          <w:bCs w:val="1"/>
-          <w:sz w:val="56"/>
-          <w:szCs w:val="56"/>
-        </w:rPr>
-        <w:t>feladat</w:t>
-      </w:r>
-      <w:r>
-        <w:rPr>
-          <w:b w:val="1"/>
-          <w:bCs w:val="1"/>
-          <w:sz w:val="56"/>
-          <w:szCs w:val="56"/>
-        </w:rPr>
-        <w:t xml:space="preserve"> 2025</w:t>
+        <w:t>Szorgalmi nagyházi feladat 2025</w:t>
       </w:r>
     </w:p>
     <w:p>
@@ -99,56 +54,23 @@
         <w:jc w:val="center"/>
       </w:pPr>
       <w:r>
-        <w:rPr/>
-        <w:t>Bánfalvi</w:t>
-      </w:r>
-      <w:r>
-        <w:rPr/>
-        <w:t>-Kovács Tivadar</w:t>
-      </w:r>
-      <w:r>
-        <w:rPr/>
-        <w:t xml:space="preserve"> – </w:t>
-      </w:r>
-      <w:r>
-        <w:rPr/>
-        <w:t>PHMPDE</w:t>
+        <w:t>Bánfalvi-Kovács Tivadar – PHMPDE</w:t>
       </w:r>
     </w:p>
     <w:p>
       <w:pPr>
         <w:jc w:val="center"/>
-        <w:rPr>
-          <w:lang w:val="hu-HU"/>
-        </w:rPr>
-      </w:pPr>
-      <w:r>
-        <w:rPr/>
-        <w:t>Juh</w:t>
-      </w:r>
-      <w:r>
-        <w:rPr/>
-        <w:t>ász Milán – LEO234</w:t>
+      </w:pPr>
+      <w:r>
+        <w:t>Juhász Milán – LEO234</w:t>
       </w:r>
     </w:p>
     <w:p>
       <w:pPr>
         <w:jc w:val="center"/>
-        <w:rPr>
-          <w:lang w:val="hu-HU"/>
-        </w:rPr>
-      </w:pPr>
-      <w:r>
-        <w:rPr/>
-        <w:t>Várszegi Vince</w:t>
-      </w:r>
-      <w:r>
-        <w:rPr/>
-        <w:t xml:space="preserve"> - </w:t>
-      </w:r>
-      <w:r>
-        <w:rPr/>
-        <w:t>LM5X1V</w:t>
+      </w:pPr>
+      <w:r>
+        <w:t>Várszegi Vince - LM5X1V</w:t>
       </w:r>
     </w:p>
     <w:p>
@@ -172,143 +94,90 @@
           <w:numId w:val="3"/>
         </w:numPr>
         <w:ind w:left="990" w:hanging="630"/>
+      </w:pPr>
+      <w:r>
+        <w:lastRenderedPageBreak/>
+        <w:t>Bevezetés</w:t>
+      </w:r>
+    </w:p>
+    <w:p>
+      <w:r>
+        <w:t>A karakterek felismerése íródjanak azok bármilyen betűtípusban</w:t>
+      </w:r>
+      <w:r>
+        <w:t xml:space="preserve"> és legyenek azok bármek</w:t>
+      </w:r>
+      <w:r>
+        <w:t>k</w:t>
+      </w:r>
+      <w:r>
+        <w:t>orák</w:t>
+      </w:r>
+      <w:r>
+        <w:t xml:space="preserve"> is</w:t>
+      </w:r>
+      <w:r>
+        <w:t xml:space="preserve">, nagyon </w:t>
+      </w:r>
+      <w:r>
+        <w:t xml:space="preserve">hasznos például dokumentumok digitalizálása </w:t>
+      </w:r>
+      <w:r>
+        <w:t xml:space="preserve">vagy képekből szöveg kinyerése esetén. </w:t>
+      </w:r>
+      <w:r>
+        <w:t>Terveink szerint egy 2 dimenziós konvolúciós neurális hálóval, fogjuk a karaktereinket meghatár</w:t>
+      </w:r>
+      <w:r>
+        <w:t>ozni, amik ugye különböző</w:t>
+      </w:r>
+      <w:r>
+        <w:t xml:space="preserve"> </w:t>
+      </w:r>
+      <w:r>
+        <w:t>betűtípusból</w:t>
+      </w:r>
+      <w:r>
+        <w:t xml:space="preserve"> különböző betűméretből állnak</w:t>
+      </w:r>
+      <w:r>
+        <w:t>.</w:t>
+      </w:r>
+      <w:r>
+        <w:t xml:space="preserve"> </w:t>
+      </w:r>
+      <w:r>
+        <w:t>S</w:t>
+      </w:r>
+      <w:r>
+        <w:t>őt még számokat</w:t>
+      </w:r>
+      <w:r>
+        <w:t>,</w:t>
+      </w:r>
+      <w:r>
+        <w:t xml:space="preserve"> illetve ki</w:t>
+      </w:r>
+      <w:r>
+        <w:t>s és nagy betűket is tartalmazhatnak</w:t>
+      </w:r>
+      <w:r>
+        <w:t>.</w:t>
+      </w:r>
+    </w:p>
+    <w:p>
+      <w:r>
+        <w:t>A karakterfelismerés a fent említett hasznok miatt egy sűrűn kutatott terület, viszont a szakirodalom nagy része inkáb</w:t>
+      </w:r>
+      <w:r>
+        <w:t>b az írott betűk felismerésével foglalkozik. Az</w:t>
+      </w:r>
+      <w:r>
         <w:rPr>
-          <w:lang w:val="hu-HU"/>
+          <w:noProof/>
         </w:rPr>
-      </w:pPr>
-      <w:r>
-        <w:rPr/>
-        <w:t>Beve</w:t>
-      </w:r>
-      <w:r>
-        <w:rPr/>
-        <w:t>zetés</w:t>
-      </w:r>
-    </w:p>
-    <w:p>
-      <w:pPr>
-        <w:pStyle w:val="Normal"/>
-      </w:pPr>
-      <w:r>
-        <w:rPr/>
-        <w:t>A karakterek felismerése íródjanak azok bármilyen betűtípusban</w:t>
-      </w:r>
-      <w:r>
-        <w:rPr/>
-        <w:t xml:space="preserve"> és legyenek azok bármek</w:t>
-      </w:r>
-      <w:r>
-        <w:rPr/>
-        <w:t>k</w:t>
-      </w:r>
-      <w:r>
-        <w:rPr/>
-        <w:t>orák</w:t>
-      </w:r>
-      <w:r>
-        <w:rPr/>
-        <w:t xml:space="preserve"> is</w:t>
-      </w:r>
-      <w:r>
-        <w:rPr/>
-        <w:t>,</w:t>
-      </w:r>
-      <w:r>
-        <w:rPr/>
-        <w:t xml:space="preserve"> nagyon </w:t>
-      </w:r>
-      <w:r>
-        <w:rPr/>
-        <w:t xml:space="preserve">hasznos például dokumentumok digitalizálása </w:t>
-      </w:r>
-      <w:r>
-        <w:rPr/>
-        <w:t xml:space="preserve">vagy képekből szöveg kinyerése esetén. </w:t>
-      </w:r>
-      <w:r>
-        <w:rPr/>
-        <w:t xml:space="preserve">Terveink szerint egy 2 dimenziós </w:t>
-      </w:r>
-      <w:r>
-        <w:rPr/>
-        <w:t>konvolúciós</w:t>
-      </w:r>
-      <w:r>
-        <w:rPr/>
-        <w:t xml:space="preserve"> neurális hálóval, fogjuk a karaktereinket meghatár</w:t>
-      </w:r>
-      <w:r>
-        <w:rPr/>
-        <w:t>ozni, amik ugye különböző</w:t>
-      </w:r>
-      <w:r>
-        <w:rPr/>
-        <w:t xml:space="preserve"> </w:t>
-      </w:r>
-      <w:r>
-        <w:rPr/>
-        <w:t>betűtípusból</w:t>
-      </w:r>
-      <w:r>
-        <w:rPr/>
-        <w:t xml:space="preserve"> különböző betűméretből állnak</w:t>
-      </w:r>
-      <w:r>
-        <w:rPr/>
-        <w:t>.</w:t>
-      </w:r>
-      <w:r>
-        <w:rPr/>
-        <w:t xml:space="preserve"> </w:t>
-      </w:r>
-      <w:r>
-        <w:rPr/>
-        <w:t>S</w:t>
-      </w:r>
-      <w:r>
-        <w:rPr/>
-        <w:t xml:space="preserve">őt még </w:t>
-      </w:r>
-      <w:r>
-        <w:rPr/>
-        <w:t>számokat</w:t>
-      </w:r>
-      <w:r>
-        <w:rPr/>
-        <w:t>,</w:t>
-      </w:r>
-      <w:r>
-        <w:rPr/>
-        <w:t xml:space="preserve"> illetve ki</w:t>
-      </w:r>
-      <w:r>
-        <w:rPr/>
-        <w:t>s és nagy betűket is tartalmazhatnak</w:t>
-      </w:r>
-      <w:r>
-        <w:rPr/>
-        <w:t>.</w:t>
-      </w:r>
-    </w:p>
-    <w:p>
-      <w:pPr>
-        <w:pStyle w:val="Normal"/>
-      </w:pPr>
-      <w:r>
-        <w:rPr/>
-        <w:t>A karakterfelismerés a fent említett hasznok miatt egy sűrűn kutatott terület, viszont a szakirodalom nagy része inkáb</w:t>
-      </w:r>
-      <w:r>
-        <w:rPr/>
-        <w:t>b az írott</w:t>
-      </w:r>
-      <w:r>
-        <w:rPr/>
-        <w:t xml:space="preserve"> betűk felismerésével foglalkozik. Az</w:t>
-      </w:r>
-      <w:r>
         <w:drawing>
-          <wp:anchor distT="0" distB="0" distL="114300" distR="114300" simplePos="0" relativeHeight="251658240" behindDoc="0" locked="0" layoutInCell="1" allowOverlap="1" wp14:editId="085B6866" wp14:anchorId="49319539">
+          <wp:anchor distT="0" distB="0" distL="114300" distR="114300" simplePos="0" relativeHeight="251657216" behindDoc="0" locked="0" layoutInCell="1" allowOverlap="1" wp14:anchorId="49319539" wp14:editId="085B6866">
             <wp:simplePos x="0" y="0"/>
             <wp:positionH relativeFrom="column">
               <wp:align>right</wp:align>
@@ -321,17 +190,17 @@
             <wp:wrapSquare wrapText="bothSides"/>
             <wp:docPr id="1410656416" name="drawing"/>
             <wp:cNvGraphicFramePr>
-              <a:graphicFrameLocks noChangeAspect="1"/>
+              <a:graphicFrameLocks xmlns:a="http://schemas.openxmlformats.org/drawingml/2006/main" noChangeAspect="1"/>
             </wp:cNvGraphicFramePr>
-            <a:graphic>
-              <a:graphicData xmlns:a="http://schemas.openxmlformats.org/drawingml/2006/main" uri="http://schemas.openxmlformats.org/drawingml/2006/picture">
+            <a:graphic xmlns:a="http://schemas.openxmlformats.org/drawingml/2006/main">
+              <a:graphicData uri="http://schemas.openxmlformats.org/drawingml/2006/picture">
                 <pic:pic xmlns:pic="http://schemas.openxmlformats.org/drawingml/2006/picture">
                   <pic:nvPicPr>
                     <pic:cNvPr id="856235442" name="Picture 856235442"/>
                     <pic:cNvPicPr/>
                   </pic:nvPicPr>
                   <pic:blipFill>
-                    <a:blip xmlns:r="http://schemas.openxmlformats.org/officeDocument/2006/relationships" r:embed="rId38034678">
+                    <a:blip r:embed="rId5">
                       <a:extLst>
                         <a:ext uri="{28A0092B-C50C-407E-A947-70E740481C1C}">
                           <a14:useLocalDpi xmlns:a14="http://schemas.microsoft.com/office/drawing/2010/main"/>
@@ -343,7 +212,7 @@
                     </a:stretch>
                   </pic:blipFill>
                   <pic:spPr>
-                    <a:xfrm rot="0">
+                    <a:xfrm>
                       <a:off x="0" y="0"/>
                       <a:ext cx="2910764" cy="1175501"/>
                     </a:xfrm>
@@ -364,51 +233,26 @@
         </w:drawing>
       </w:r>
       <w:r>
-        <w:rPr/>
-        <w:t xml:space="preserve"> 1.</w:t>
-      </w:r>
-      <w:r>
-        <w:rPr/>
-        <w:t xml:space="preserve"> forrásu</w:t>
-      </w:r>
-      <w:r>
-        <w:rPr/>
-        <w:t>nkban is egy ilyen adathalmazon tudtak elérni</w:t>
-      </w:r>
-      <w:r>
-        <w:rPr/>
-        <w:t xml:space="preserve"> 92,91% -os pontosságot </w:t>
-      </w:r>
-      <w:r>
-        <w:rPr/>
-        <w:t>konvolúciós</w:t>
-      </w:r>
-      <w:r>
-        <w:rPr/>
-        <w:t xml:space="preserve"> hálókat használva</w:t>
-      </w:r>
-      <w:r>
-        <w:rPr/>
-        <w:t xml:space="preserve">, a</w:t>
-      </w:r>
-      <w:r>
-        <w:rPr/>
-        <w:t xml:space="preserve">hogy a mellékelt ábrán is látszik.</w:t>
-      </w:r>
-    </w:p>
-    <w:p>
-      <w:pPr>
-        <w:pStyle w:val="Normal"/>
-      </w:pPr>
-      <w:r>
-        <w:rPr/>
+        <w:t xml:space="preserve"> 1. forrásunkban is egy ilyen adathalmazon tudtak elérni</w:t>
+      </w:r>
+      <w:r>
+        <w:t xml:space="preserve"> 92,91% -os pontosságot konvolúciós hálókat használva</w:t>
+      </w:r>
+      <w:r>
+        <w:t>, ahogy a mellékelt ábrán is látszik.</w:t>
+      </w:r>
+    </w:p>
+    <w:p>
+      <w:r>
         <w:t>Olyan kutatást, ami nyomtatott szövegekkel foglalkozik, egyet találtunk</w:t>
       </w:r>
       <w:r>
-        <w:rPr/>
         <w:t>, ez azonban nem</w:t>
       </w:r>
       <w:r>
+        <w:rPr>
+          <w:noProof/>
+        </w:rPr>
         <w:drawing>
           <wp:anchor distT="0" distB="0" distL="114300" distR="114300" simplePos="0" relativeHeight="251658240" behindDoc="0" locked="0" layoutInCell="1" allowOverlap="1" wp14:anchorId="1C4360EA" wp14:editId="19CF1BD2">
             <wp:simplePos x="0" y="0"/>
@@ -423,17 +267,17 @@
             <wp:wrapSquare wrapText="bothSides"/>
             <wp:docPr id="1910205762" name="drawing"/>
             <wp:cNvGraphicFramePr>
-              <a:graphicFrameLocks noChangeAspect="1"/>
+              <a:graphicFrameLocks xmlns:a="http://schemas.openxmlformats.org/drawingml/2006/main" noChangeAspect="1"/>
             </wp:cNvGraphicFramePr>
-            <a:graphic>
-              <a:graphicData xmlns:a="http://schemas.openxmlformats.org/drawingml/2006/main" uri="http://schemas.openxmlformats.org/drawingml/2006/picture">
+            <a:graphic xmlns:a="http://schemas.openxmlformats.org/drawingml/2006/main">
+              <a:graphicData uri="http://schemas.openxmlformats.org/drawingml/2006/picture">
                 <pic:pic xmlns:pic="http://schemas.openxmlformats.org/drawingml/2006/picture">
                   <pic:nvPicPr>
                     <pic:cNvPr id="1562029325" name="Picture 1562029325"/>
                     <pic:cNvPicPr/>
                   </pic:nvPicPr>
                   <pic:blipFill>
-                    <a:blip xmlns:r="http://schemas.openxmlformats.org/officeDocument/2006/relationships" r:embed="rId1705753823">
+                    <a:blip r:embed="rId6">
                       <a:extLst>
                         <a:ext uri="{28A0092B-C50C-407E-A947-70E740481C1C}">
                           <a14:useLocalDpi xmlns:a14="http://schemas.microsoft.com/office/drawing/2010/main"/>
@@ -445,7 +289,7 @@
                     </a:stretch>
                   </pic:blipFill>
                   <pic:spPr>
-                    <a:xfrm rot="0">
+                    <a:xfrm>
                       <a:off x="0" y="0"/>
                       <a:ext cx="2574408" cy="1419225"/>
                     </a:xfrm>
@@ -466,96 +310,37 @@
         </w:drawing>
       </w:r>
       <w:r>
-        <w:rPr/>
+        <w:t xml:space="preserve"> konvolúciót</w:t>
+      </w:r>
+      <w:r>
+        <w:t>, hanem SOM (Self Organizing Map) -et ha</w:t>
+      </w:r>
+      <w:r>
+        <w:t>sználtak</w:t>
+      </w:r>
+      <w:r>
+        <w:t xml:space="preserve"> az osztályozáshoz</w:t>
+      </w:r>
+      <w:r>
+        <w:t xml:space="preserve"> és csak nagy betűkkel foglalkozott</w:t>
+      </w:r>
+      <w:r>
+        <w:t>.</w:t>
+      </w:r>
+      <w:r>
+        <w:t xml:space="preserve"> Ennek a cikknek látható a betűre lebontott h</w:t>
+      </w:r>
+      <w:r>
+        <w:t xml:space="preserve">elyessége. </w:t>
+      </w:r>
+      <w:r>
         <w:t xml:space="preserve"> </w:t>
       </w:r>
-      <w:r>
-        <w:rPr/>
-        <w:t>konvolúciót</w:t>
-      </w:r>
-      <w:r>
-        <w:rPr/>
-        <w:t>, hanem SOM (</w:t>
-      </w:r>
-      <w:r>
-        <w:rPr/>
-        <w:t>Self</w:t>
-      </w:r>
-      <w:r>
-        <w:rPr/>
-        <w:t xml:space="preserve"> </w:t>
-      </w:r>
-      <w:r>
-        <w:rPr/>
-        <w:t>Organizing</w:t>
-      </w:r>
-      <w:r>
-        <w:rPr/>
-        <w:t xml:space="preserve"> Map) -</w:t>
-      </w:r>
-      <w:r>
-        <w:rPr/>
-        <w:t>et</w:t>
-      </w:r>
-      <w:r>
-        <w:rPr/>
-        <w:t xml:space="preserve"> ha</w:t>
-      </w:r>
-      <w:r>
-        <w:rPr/>
-        <w:t>sználtak</w:t>
-      </w:r>
-      <w:r>
-        <w:rPr/>
-        <w:t xml:space="preserve"> az osztályozáshoz</w:t>
-      </w:r>
-      <w:r>
-        <w:rPr/>
-        <w:t xml:space="preserve"> és csak nagy betűkkel foglalkozott</w:t>
-      </w:r>
-      <w:r>
-        <w:rPr/>
-        <w:t xml:space="preserve">.</w:t>
-      </w:r>
-      <w:r>
-        <w:rPr/>
-        <w:t xml:space="preserve"> </w:t>
-      </w:r>
-      <w:r>
-        <w:rPr/>
-        <w:t xml:space="preserve">Ennek a cikknek látható a betűre lebontott h</w:t>
-      </w:r>
-      <w:r>
-        <w:rPr/>
-        <w:t xml:space="preserve">elyessége. </w:t>
-      </w:r>
-      <w:r>
-        <w:rPr/>
-        <w:t xml:space="preserve"> </w:t>
-      </w:r>
-    </w:p>
-    <w:p>
-      <w:pPr>
-        <w:pStyle w:val="Normal"/>
-      </w:pPr>
-    </w:p>
-    <w:p>
-      <w:pPr>
-        <w:pStyle w:val="Normal"/>
-      </w:pPr>
-    </w:p>
-    <w:p>
-      <w:pPr>
-        <w:pStyle w:val="Normal"/>
-      </w:pPr>
-    </w:p>
-    <w:p>
-      <w:pPr>
-        <w:rPr>
-          <w:lang w:val="hu-HU"/>
-        </w:rPr>
-      </w:pPr>
-    </w:p>
+    </w:p>
+    <w:p/>
+    <w:p/>
+    <w:p/>
+    <w:p/>
     <w:p>
       <w:pPr>
         <w:pStyle w:val="Heading2"/>
@@ -572,92 +357,728 @@
           <w:numId w:val="3"/>
         </w:numPr>
         <w:ind w:left="900" w:hanging="630"/>
-        <w:rPr/>
-      </w:pPr>
-      <w:r>
-        <w:rPr/>
-        <w:t>Feladat</w:t>
-      </w:r>
-      <w:r>
-        <w:rPr/>
-        <w:t xml:space="preserve"> </w:t>
-      </w:r>
-      <w:r>
-        <w:rPr/>
-        <w:t>és</w:t>
-      </w:r>
-      <w:r>
-        <w:rPr/>
-        <w:t xml:space="preserve"> </w:t>
-      </w:r>
-      <w:r>
-        <w:rPr/>
-        <w:t>adathalmaz</w:t>
-      </w:r>
-      <w:r>
-        <w:rPr/>
-        <w:t xml:space="preserve"> </w:t>
-      </w:r>
-      <w:r>
-        <w:rPr/>
-        <w:t>ismertetése</w:t>
+      </w:pPr>
+      <w:r>
+        <w:lastRenderedPageBreak/>
+        <w:t>Feladat és adathalmaz ismertetése</w:t>
       </w:r>
     </w:p>
     <w:p/>
     <w:p>
       <w:r>
-        <w:t>1-10: 0-9</w:t>
-      </w:r>
-    </w:p>
-    <w:p>
-      <w:r>
-        <w:t>11-36: A-Z</w:t>
-      </w:r>
-    </w:p>
-    <w:p>
-      <w:r>
-        <w:t>37-62: a-z</w:t>
-      </w:r>
-    </w:p>
-    <w:p>
-      <w:r>
-        <w:rPr/>
-        <w:t>Normalize Data</w:t>
-      </w:r>
-      <w:r>
-        <w:rPr/>
-        <w:t xml:space="preserve"> </w:t>
-      </w:r>
-      <w:r>
-        <w:rPr/>
-        <w:t>(</w:t>
-      </w:r>
-      <w:r>
-        <w:rPr/>
-        <w:t>megvizsgaltuk</w:t>
-      </w:r>
-      <w:r>
-        <w:rPr/>
-        <w:t xml:space="preserve">, </w:t>
-      </w:r>
-      <w:r>
-        <w:rPr/>
-        <w:t>nem</w:t>
-      </w:r>
-      <w:r>
-        <w:rPr/>
-        <w:t xml:space="preserve"> </w:t>
-      </w:r>
-      <w:r>
-        <w:rPr/>
-        <w:t>kell</w:t>
-      </w:r>
-      <w:r>
-        <w:rPr/>
-        <w:t>)</w:t>
-      </w:r>
-    </w:p>
-    <w:p/>
+        <w:t>Az adatahalmazt két tömörített fájlként kaptuk meg, ezeket kitömörítve számozott mappákba rendezve találhatók meg egyes típusú karakterek képei. Az 1-10-ig találhatók a számok 0-9-ig. 11-36-ig az angol abc betűnek nagy, 37-62-ig a kicsi változatai. A képek 128x128 pixelesek. Az adathalmazt különböző betűtípusú nyomtatott karaktereket képzik. A feladatunk, ezt tanítóadatként felhasználva egy mélytanulási osztályozó modell tervezése és tanítása, ami képes ismeretlen képren azonosítani a tanítóadatokban szereplő karaktereket valamelyikét.</w:t>
+      </w:r>
+    </w:p>
+    <w:p>
+      <w:r>
+        <w:rPr>
+          <w:noProof/>
+        </w:rPr>
+        <mc:AlternateContent>
+          <mc:Choice Requires="wps">
+            <w:drawing>
+              <wp:anchor distT="0" distB="0" distL="114300" distR="114300" simplePos="0" relativeHeight="251662336" behindDoc="0" locked="0" layoutInCell="1" allowOverlap="1" wp14:anchorId="71D8BE91" wp14:editId="3E529D97">
+                <wp:simplePos x="0" y="0"/>
+                <wp:positionH relativeFrom="margin">
+                  <wp:align>right</wp:align>
+                </wp:positionH>
+                <wp:positionV relativeFrom="paragraph">
+                  <wp:posOffset>1160780</wp:posOffset>
+                </wp:positionV>
+                <wp:extent cx="1219200" cy="161925"/>
+                <wp:effectExtent l="0" t="0" r="0" b="9525"/>
+                <wp:wrapSquare wrapText="bothSides"/>
+                <wp:docPr id="1195274747" name="Text Box 1"/>
+                <wp:cNvGraphicFramePr/>
+                <a:graphic xmlns:a="http://schemas.openxmlformats.org/drawingml/2006/main">
+                  <a:graphicData uri="http://schemas.microsoft.com/office/word/2010/wordprocessingShape">
+                    <wps:wsp>
+                      <wps:cNvSpPr txBox="1"/>
+                      <wps:spPr>
+                        <a:xfrm>
+                          <a:off x="0" y="0"/>
+                          <a:ext cx="1219200" cy="161925"/>
+                        </a:xfrm>
+                        <a:prstGeom prst="rect">
+                          <a:avLst/>
+                        </a:prstGeom>
+                        <a:noFill/>
+                        <a:ln>
+                          <a:noFill/>
+                        </a:ln>
+                      </wps:spPr>
+                      <wps:txbx>
+                        <w:txbxContent>
+                          <w:p>
+                            <w:pPr>
+                              <w:pStyle w:val="Caption"/>
+                              <w:jc w:val="center"/>
+                              <w:rPr>
+                                <w:noProof/>
+                              </w:rPr>
+                            </w:pPr>
+                            <w:r>
+                              <w:t>Rendkívül kicsi Q</w:t>
+                            </w:r>
+                          </w:p>
+                        </w:txbxContent>
+                      </wps:txbx>
+                      <wps:bodyPr rot="0" spcFirstLastPara="0" vertOverflow="overflow" horzOverflow="overflow" vert="horz" wrap="square" lIns="0" tIns="0" rIns="0" bIns="0" numCol="1" spcCol="0" rtlCol="0" fromWordArt="0" anchor="t" anchorCtr="0" forceAA="0" compatLnSpc="1">
+                        <a:prstTxWarp prst="textNoShape">
+                          <a:avLst/>
+                        </a:prstTxWarp>
+                        <a:noAutofit/>
+                      </wps:bodyPr>
+                    </wps:wsp>
+                  </a:graphicData>
+                </a:graphic>
+                <wp14:sizeRelV relativeFrom="margin">
+                  <wp14:pctHeight>0</wp14:pctHeight>
+                </wp14:sizeRelV>
+              </wp:anchor>
+            </w:drawing>
+          </mc:Choice>
+          <mc:Fallback>
+            <w:pict>
+              <v:shapetype w14:anchorId="71D8BE91" id="_x0000_t202" coordsize="21600,21600" o:spt="202" path="m,l,21600r21600,l21600,xe">
+                <v:stroke joinstyle="miter"/>
+                <v:path gradientshapeok="t" o:connecttype="rect"/>
+              </v:shapetype>
+              <v:shape id="Text Box 1" o:spid="_x0000_s1026" type="#_x0000_t202" style="position:absolute;margin-left:44.8pt;margin-top:91.4pt;width:96pt;height:12.75pt;z-index:251662336;visibility:visible;mso-wrap-style:square;mso-height-percent:0;mso-wrap-distance-left:9pt;mso-wrap-distance-top:0;mso-wrap-distance-right:9pt;mso-wrap-distance-bottom:0;mso-position-horizontal:right;mso-position-horizontal-relative:margin;mso-position-vertical:absolute;mso-position-vertical-relative:text;mso-height-percent:0;mso-height-relative:margin;v-text-anchor:top" o:gfxdata="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" filled="f" stroked="f">
+                <v:textbox inset="0,0,0,0">
+                  <w:txbxContent>
+                    <w:p>
+                      <w:pPr>
+                        <w:pStyle w:val="Caption"/>
+                        <w:jc w:val="center"/>
+                        <w:rPr>
+                          <w:noProof/>
+                        </w:rPr>
+                      </w:pPr>
+                      <w:r>
+                        <w:t>Rendkívül kicsi Q</w:t>
+                      </w:r>
+                    </w:p>
+                  </w:txbxContent>
+                </v:textbox>
+                <w10:wrap type="square" anchorx="margin"/>
+              </v:shape>
+            </w:pict>
+          </mc:Fallback>
+        </mc:AlternateContent>
+      </w:r>
+      <w:r>
+        <w:rPr>
+          <w:noProof/>
+        </w:rPr>
+        <w:drawing>
+          <wp:anchor distT="0" distB="0" distL="114300" distR="114300" simplePos="0" relativeHeight="251659264" behindDoc="0" locked="0" layoutInCell="1" allowOverlap="1" wp14:anchorId="468479EA" wp14:editId="0008A59C">
+            <wp:simplePos x="0" y="0"/>
+            <wp:positionH relativeFrom="margin">
+              <wp:posOffset>4800600</wp:posOffset>
+            </wp:positionH>
+            <wp:positionV relativeFrom="paragraph">
+              <wp:posOffset>27305</wp:posOffset>
+            </wp:positionV>
+            <wp:extent cx="1066800" cy="1066800"/>
+            <wp:effectExtent l="19050" t="19050" r="19050" b="19050"/>
+            <wp:wrapSquare wrapText="bothSides"/>
+            <wp:docPr id="234171759" name="Picture 1" descr="A black letter on a white background&#10;&#10;AI-generated content may be incorrect."/>
+            <wp:cNvGraphicFramePr>
+              <a:graphicFrameLocks xmlns:a="http://schemas.openxmlformats.org/drawingml/2006/main" noChangeAspect="1"/>
+            </wp:cNvGraphicFramePr>
+            <a:graphic xmlns:a="http://schemas.openxmlformats.org/drawingml/2006/main">
+              <a:graphicData uri="http://schemas.openxmlformats.org/drawingml/2006/picture">
+                <pic:pic xmlns:pic="http://schemas.openxmlformats.org/drawingml/2006/picture">
+                  <pic:nvPicPr>
+                    <pic:cNvPr id="234171759" name="Picture 1" descr="A black letter on a white background&#10;&#10;AI-generated content may be incorrect."/>
+                    <pic:cNvPicPr>
+                      <a:picLocks noChangeAspect="1" noChangeArrowheads="1"/>
+                    </pic:cNvPicPr>
+                  </pic:nvPicPr>
+                  <pic:blipFill>
+                    <a:blip r:embed="rId7">
+                      <a:extLst>
+                        <a:ext uri="{28A0092B-C50C-407E-A947-70E740481C1C}">
+                          <a14:useLocalDpi xmlns:a14="http://schemas.microsoft.com/office/drawing/2010/main" val="0"/>
+                        </a:ext>
+                      </a:extLst>
+                    </a:blip>
+                    <a:srcRect/>
+                    <a:stretch>
+                      <a:fillRect/>
+                    </a:stretch>
+                  </pic:blipFill>
+                  <pic:spPr bwMode="auto">
+                    <a:xfrm>
+                      <a:off x="0" y="0"/>
+                      <a:ext cx="1066800" cy="1066800"/>
+                    </a:xfrm>
+                    <a:prstGeom prst="rect">
+                      <a:avLst/>
+                    </a:prstGeom>
+                    <a:noFill/>
+                    <a:ln w="3175">
+                      <a:solidFill>
+                        <a:schemeClr val="tx1"/>
+                      </a:solidFill>
+                    </a:ln>
+                  </pic:spPr>
+                </pic:pic>
+              </a:graphicData>
+            </a:graphic>
+            <wp14:sizeRelH relativeFrom="margin">
+              <wp14:pctWidth>0</wp14:pctWidth>
+            </wp14:sizeRelH>
+            <wp14:sizeRelV relativeFrom="margin">
+              <wp14:pctHeight>0</wp14:pctHeight>
+            </wp14:sizeRelV>
+          </wp:anchor>
+        </w:drawing>
+      </w:r>
+      <w:r>
+        <w:t>Az adathalmazt tüzetesebben megvizsgálva felfedeztünk lehetséges problémákat, melyek megnehezíthetik a modell tanítását és ronthattják a predikciók jóságát. Találtunk olyan karaktereket, melyek nagyon kis méretűek, majdnemhogy egy pontként látszanak a kép közepén. Emiatt lehetséges, hogy szükség less valamilyen outlier szűrésre az adatok felhasználása előtt.</w:t>
+      </w:r>
+    </w:p>
+    <w:p>
+      <w:r>
+        <w:rPr>
+          <w:noProof/>
+        </w:rPr>
+        <w:drawing>
+          <wp:anchor distT="0" distB="0" distL="114300" distR="114300" simplePos="0" relativeHeight="251668480" behindDoc="0" locked="0" layoutInCell="1" allowOverlap="1" wp14:anchorId="6F8FDC0C" wp14:editId="4F19B6AD">
+            <wp:simplePos x="0" y="0"/>
+            <wp:positionH relativeFrom="column">
+              <wp:posOffset>3219450</wp:posOffset>
+            </wp:positionH>
+            <wp:positionV relativeFrom="paragraph">
+              <wp:posOffset>13970</wp:posOffset>
+            </wp:positionV>
+            <wp:extent cx="1219200" cy="1219200"/>
+            <wp:effectExtent l="0" t="0" r="0" b="0"/>
+            <wp:wrapSquare wrapText="bothSides"/>
+            <wp:docPr id="1249878640" name="Picture 3" descr="A black letter with a white background&#10;&#10;AI-generated content may be incorrect."/>
+            <wp:cNvGraphicFramePr>
+              <a:graphicFrameLocks xmlns:a="http://schemas.openxmlformats.org/drawingml/2006/main" noChangeAspect="1"/>
+            </wp:cNvGraphicFramePr>
+            <a:graphic xmlns:a="http://schemas.openxmlformats.org/drawingml/2006/main">
+              <a:graphicData uri="http://schemas.openxmlformats.org/drawingml/2006/picture">
+                <pic:pic xmlns:pic="http://schemas.openxmlformats.org/drawingml/2006/picture">
+                  <pic:nvPicPr>
+                    <pic:cNvPr id="1249878640" name="Picture 3" descr="A black letter with a white background&#10;&#10;AI-generated content may be incorrect."/>
+                    <pic:cNvPicPr>
+                      <a:picLocks noChangeAspect="1" noChangeArrowheads="1"/>
+                    </pic:cNvPicPr>
+                  </pic:nvPicPr>
+                  <pic:blipFill>
+                    <a:blip r:embed="rId8">
+                      <a:extLst>
+                        <a:ext uri="{28A0092B-C50C-407E-A947-70E740481C1C}">
+                          <a14:useLocalDpi xmlns:a14="http://schemas.microsoft.com/office/drawing/2010/main" val="0"/>
+                        </a:ext>
+                      </a:extLst>
+                    </a:blip>
+                    <a:srcRect/>
+                    <a:stretch>
+                      <a:fillRect/>
+                    </a:stretch>
+                  </pic:blipFill>
+                  <pic:spPr bwMode="auto">
+                    <a:xfrm>
+                      <a:off x="0" y="0"/>
+                      <a:ext cx="1219200" cy="1219200"/>
+                    </a:xfrm>
+                    <a:prstGeom prst="rect">
+                      <a:avLst/>
+                    </a:prstGeom>
+                    <a:noFill/>
+                    <a:ln>
+                      <a:noFill/>
+                    </a:ln>
+                  </pic:spPr>
+                </pic:pic>
+              </a:graphicData>
+            </a:graphic>
+          </wp:anchor>
+        </w:drawing>
+      </w:r>
+      <w:r>
+        <w:rPr>
+          <w:noProof/>
+        </w:rPr>
+        <w:drawing>
+          <wp:anchor distT="0" distB="0" distL="114300" distR="114300" simplePos="0" relativeHeight="251669504" behindDoc="0" locked="0" layoutInCell="1" allowOverlap="1" wp14:anchorId="166BE773" wp14:editId="3BEEDCAB">
+            <wp:simplePos x="0" y="0"/>
+            <wp:positionH relativeFrom="margin">
+              <wp:align>right</wp:align>
+            </wp:positionH>
+            <wp:positionV relativeFrom="paragraph">
+              <wp:posOffset>13970</wp:posOffset>
+            </wp:positionV>
+            <wp:extent cx="1219200" cy="1219200"/>
+            <wp:effectExtent l="0" t="0" r="0" b="0"/>
+            <wp:wrapSquare wrapText="bothSides"/>
+            <wp:docPr id="1825900916" name="Picture 4" descr="A black letter with a white background&#10;&#10;AI-generated content may be incorrect."/>
+            <wp:cNvGraphicFramePr>
+              <a:graphicFrameLocks xmlns:a="http://schemas.openxmlformats.org/drawingml/2006/main" noChangeAspect="1"/>
+            </wp:cNvGraphicFramePr>
+            <a:graphic xmlns:a="http://schemas.openxmlformats.org/drawingml/2006/main">
+              <a:graphicData uri="http://schemas.openxmlformats.org/drawingml/2006/picture">
+                <pic:pic xmlns:pic="http://schemas.openxmlformats.org/drawingml/2006/picture">
+                  <pic:nvPicPr>
+                    <pic:cNvPr id="1825900916" name="Picture 4" descr="A black letter with a white background&#10;&#10;AI-generated content may be incorrect."/>
+                    <pic:cNvPicPr>
+                      <a:picLocks noChangeAspect="1" noChangeArrowheads="1"/>
+                    </pic:cNvPicPr>
+                  </pic:nvPicPr>
+                  <pic:blipFill>
+                    <a:blip r:embed="rId9">
+                      <a:extLst>
+                        <a:ext uri="{28A0092B-C50C-407E-A947-70E740481C1C}">
+                          <a14:useLocalDpi xmlns:a14="http://schemas.microsoft.com/office/drawing/2010/main" val="0"/>
+                        </a:ext>
+                      </a:extLst>
+                    </a:blip>
+                    <a:srcRect/>
+                    <a:stretch>
+                      <a:fillRect/>
+                    </a:stretch>
+                  </pic:blipFill>
+                  <pic:spPr bwMode="auto">
+                    <a:xfrm>
+                      <a:off x="0" y="0"/>
+                      <a:ext cx="1219200" cy="1219200"/>
+                    </a:xfrm>
+                    <a:prstGeom prst="rect">
+                      <a:avLst/>
+                    </a:prstGeom>
+                    <a:noFill/>
+                    <a:ln>
+                      <a:noFill/>
+                    </a:ln>
+                  </pic:spPr>
+                </pic:pic>
+              </a:graphicData>
+            </a:graphic>
+          </wp:anchor>
+        </w:drawing>
+      </w:r>
+      <w:r>
+        <w:t>Emellett találtunk olyan karaktereket, ahol a kis és nagy változatok vagy nagyon hasonlóak, vagy akár teljesen megegyeznek egymással. Ez várhatóan rontani fogja a találati rátát ezeknél a karaktereknél.</w:t>
+      </w:r>
+    </w:p>
+    <w:p>
+      <w:r>
+        <w:rPr>
+          <w:noProof/>
+        </w:rPr>
+        <mc:AlternateContent>
+          <mc:Choice Requires="wps">
+            <w:drawing>
+              <wp:anchor distT="0" distB="0" distL="114300" distR="114300" simplePos="0" relativeHeight="251667456" behindDoc="0" locked="0" layoutInCell="1" allowOverlap="1" wp14:anchorId="61EBCE3D" wp14:editId="3413A96F">
+                <wp:simplePos x="0" y="0"/>
+                <wp:positionH relativeFrom="margin">
+                  <wp:align>right</wp:align>
+                </wp:positionH>
+                <wp:positionV relativeFrom="paragraph">
+                  <wp:posOffset>34925</wp:posOffset>
+                </wp:positionV>
+                <wp:extent cx="1209675" cy="238125"/>
+                <wp:effectExtent l="0" t="0" r="0" b="0"/>
+                <wp:wrapNone/>
+                <wp:docPr id="586211122" name="Rectangle 5"/>
+                <wp:cNvGraphicFramePr/>
+                <a:graphic xmlns:a="http://schemas.openxmlformats.org/drawingml/2006/main">
+                  <a:graphicData uri="http://schemas.microsoft.com/office/word/2010/wordprocessingShape">
+                    <wps:wsp>
+                      <wps:cNvSpPr/>
+                      <wps:spPr>
+                        <a:xfrm>
+                          <a:off x="0" y="0"/>
+                          <a:ext cx="1209675" cy="238125"/>
+                        </a:xfrm>
+                        <a:prstGeom prst="rect">
+                          <a:avLst/>
+                        </a:prstGeom>
+                        <a:noFill/>
+                        <a:ln>
+                          <a:noFill/>
+                        </a:ln>
+                      </wps:spPr>
+                      <wps:style>
+                        <a:lnRef idx="2">
+                          <a:schemeClr val="accent1">
+                            <a:shade val="15000"/>
+                          </a:schemeClr>
+                        </a:lnRef>
+                        <a:fillRef idx="1">
+                          <a:schemeClr val="accent1"/>
+                        </a:fillRef>
+                        <a:effectRef idx="0">
+                          <a:schemeClr val="accent1"/>
+                        </a:effectRef>
+                        <a:fontRef idx="minor">
+                          <a:schemeClr val="lt1"/>
+                        </a:fontRef>
+                      </wps:style>
+                      <wps:txbx>
+                        <w:txbxContent>
+                          <w:p>
+                            <w:pPr>
+                              <w:pStyle w:val="Caption"/>
+                              <w:jc w:val="center"/>
+                            </w:pPr>
+                            <w:r>
+                              <w:t xml:space="preserve">Egy kép a </w:t>
+                            </w:r>
+                            <w:r>
+                              <w:t>kis q</w:t>
+                            </w:r>
+                            <w:r>
+                              <w:rPr>
+                                <w:noProof/>
+                              </w:rPr>
+                              <w:t>-kból</w:t>
+                            </w:r>
+                          </w:p>
+                        </w:txbxContent>
+                      </wps:txbx>
+                      <wps:bodyPr rot="0" spcFirstLastPara="0" vertOverflow="overflow" horzOverflow="overflow" vert="horz" wrap="square" lIns="91440" tIns="45720" rIns="91440" bIns="45720" numCol="1" spcCol="0" rtlCol="0" fromWordArt="0" anchor="ctr" anchorCtr="0" forceAA="0" compatLnSpc="1">
+                        <a:prstTxWarp prst="textNoShape">
+                          <a:avLst/>
+                        </a:prstTxWarp>
+                        <a:noAutofit/>
+                      </wps:bodyPr>
+                    </wps:wsp>
+                  </a:graphicData>
+                </a:graphic>
+                <wp14:sizeRelH relativeFrom="margin">
+                  <wp14:pctWidth>0</wp14:pctWidth>
+                </wp14:sizeRelH>
+                <wp14:sizeRelV relativeFrom="margin">
+                  <wp14:pctHeight>0</wp14:pctHeight>
+                </wp14:sizeRelV>
+              </wp:anchor>
+            </w:drawing>
+          </mc:Choice>
+          <mc:Fallback>
+            <w:pict>
+              <v:rect w14:anchorId="61EBCE3D" id="Rectangle 5" o:spid="_x0000_s1027" style="position:absolute;margin-left:44.05pt;margin-top:2.75pt;width:95.25pt;height:18.75pt;z-index:251667456;visibility:visible;mso-wrap-style:square;mso-width-percent:0;mso-height-percent:0;mso-wrap-distance-left:9pt;mso-wrap-distance-top:0;mso-wrap-distance-right:9pt;mso-wrap-distance-bottom:0;mso-position-horizontal:right;mso-position-horizontal-relative:margin;mso-position-vertical:absolute;mso-position-vertical-relative:text;mso-width-percent:0;mso-height-percent:0;mso-width-relative:margin;mso-height-relative:margin;v-text-anchor:middle" o:gfxdata="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" filled="f" stroked="f" strokeweight="1pt">
+                <v:textbox>
+                  <w:txbxContent>
+                    <w:p>
+                      <w:pPr>
+                        <w:pStyle w:val="Caption"/>
+                        <w:jc w:val="center"/>
+                      </w:pPr>
+                      <w:r>
+                        <w:t xml:space="preserve">Egy kép a </w:t>
+                      </w:r>
+                      <w:r>
+                        <w:t>kis q</w:t>
+                      </w:r>
+                      <w:r>
+                        <w:rPr>
+                          <w:noProof/>
+                        </w:rPr>
+                        <w:t>-kból</w:t>
+                      </w:r>
+                    </w:p>
+                  </w:txbxContent>
+                </v:textbox>
+                <w10:wrap anchorx="margin"/>
+              </v:rect>
+            </w:pict>
+          </mc:Fallback>
+        </mc:AlternateContent>
+      </w:r>
+      <w:r>
+        <w:rPr>
+          <w:noProof/>
+        </w:rPr>
+        <mc:AlternateContent>
+          <mc:Choice Requires="wps">
+            <w:drawing>
+              <wp:anchor distT="0" distB="0" distL="114300" distR="114300" simplePos="0" relativeHeight="251665408" behindDoc="0" locked="0" layoutInCell="1" allowOverlap="1" wp14:anchorId="6347263E" wp14:editId="69E8CC0F">
+                <wp:simplePos x="0" y="0"/>
+                <wp:positionH relativeFrom="column">
+                  <wp:posOffset>3181985</wp:posOffset>
+                </wp:positionH>
+                <wp:positionV relativeFrom="paragraph">
+                  <wp:posOffset>24130</wp:posOffset>
+                </wp:positionV>
+                <wp:extent cx="1295400" cy="238125"/>
+                <wp:effectExtent l="0" t="0" r="0" b="0"/>
+                <wp:wrapNone/>
+                <wp:docPr id="77766993" name="Rectangle 5"/>
+                <wp:cNvGraphicFramePr/>
+                <a:graphic xmlns:a="http://schemas.openxmlformats.org/drawingml/2006/main">
+                  <a:graphicData uri="http://schemas.microsoft.com/office/word/2010/wordprocessingShape">
+                    <wps:wsp>
+                      <wps:cNvSpPr/>
+                      <wps:spPr>
+                        <a:xfrm>
+                          <a:off x="0" y="0"/>
+                          <a:ext cx="1295400" cy="238125"/>
+                        </a:xfrm>
+                        <a:prstGeom prst="rect">
+                          <a:avLst/>
+                        </a:prstGeom>
+                        <a:noFill/>
+                        <a:ln>
+                          <a:noFill/>
+                        </a:ln>
+                      </wps:spPr>
+                      <wps:style>
+                        <a:lnRef idx="2">
+                          <a:schemeClr val="accent1">
+                            <a:shade val="15000"/>
+                          </a:schemeClr>
+                        </a:lnRef>
+                        <a:fillRef idx="1">
+                          <a:schemeClr val="accent1"/>
+                        </a:fillRef>
+                        <a:effectRef idx="0">
+                          <a:schemeClr val="accent1"/>
+                        </a:effectRef>
+                        <a:fontRef idx="minor">
+                          <a:schemeClr val="lt1"/>
+                        </a:fontRef>
+                      </wps:style>
+                      <wps:txbx>
+                        <w:txbxContent>
+                          <w:p>
+                            <w:pPr>
+                              <w:pStyle w:val="Caption"/>
+                              <w:jc w:val="center"/>
+                            </w:pPr>
+                            <w:r>
+                              <w:t>Egy kép a nagy Q</w:t>
+                            </w:r>
+                            <w:r>
+                              <w:rPr>
+                                <w:noProof/>
+                              </w:rPr>
+                              <w:t>-kból</w:t>
+                            </w:r>
+                          </w:p>
+                        </w:txbxContent>
+                      </wps:txbx>
+                      <wps:bodyPr rot="0" spcFirstLastPara="0" vertOverflow="overflow" horzOverflow="overflow" vert="horz" wrap="square" lIns="91440" tIns="45720" rIns="91440" bIns="45720" numCol="1" spcCol="0" rtlCol="0" fromWordArt="0" anchor="ctr" anchorCtr="0" forceAA="0" compatLnSpc="1">
+                        <a:prstTxWarp prst="textNoShape">
+                          <a:avLst/>
+                        </a:prstTxWarp>
+                        <a:noAutofit/>
+                      </wps:bodyPr>
+                    </wps:wsp>
+                  </a:graphicData>
+                </a:graphic>
+                <wp14:sizeRelH relativeFrom="margin">
+                  <wp14:pctWidth>0</wp14:pctWidth>
+                </wp14:sizeRelH>
+                <wp14:sizeRelV relativeFrom="margin">
+                  <wp14:pctHeight>0</wp14:pctHeight>
+                </wp14:sizeRelV>
+              </wp:anchor>
+            </w:drawing>
+          </mc:Choice>
+          <mc:Fallback>
+            <w:pict>
+              <v:rect w14:anchorId="6347263E" id="_x0000_s1028" style="position:absolute;margin-left:250.55pt;margin-top:1.9pt;width:102pt;height:18.75pt;z-index:251665408;visibility:visible;mso-wrap-style:square;mso-width-percent:0;mso-height-percent:0;mso-wrap-distance-left:9pt;mso-wrap-distance-top:0;mso-wrap-distance-right:9pt;mso-wrap-distance-bottom:0;mso-position-horizontal:absolute;mso-position-horizontal-relative:text;mso-position-vertical:absolute;mso-position-vertical-relative:text;mso-width-percent:0;mso-height-percent:0;mso-width-relative:margin;mso-height-relative:margin;v-text-anchor:middle" o:gfxdata="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" filled="f" stroked="f" strokeweight="1pt">
+                <v:textbox>
+                  <w:txbxContent>
+                    <w:p>
+                      <w:pPr>
+                        <w:pStyle w:val="Caption"/>
+                        <w:jc w:val="center"/>
+                      </w:pPr>
+                      <w:r>
+                        <w:t>Egy kép a nagy Q</w:t>
+                      </w:r>
+                      <w:r>
+                        <w:rPr>
+                          <w:noProof/>
+                        </w:rPr>
+                        <w:t>-kból</w:t>
+                      </w:r>
+                    </w:p>
+                  </w:txbxContent>
+                </v:textbox>
+              </v:rect>
+            </w:pict>
+          </mc:Fallback>
+        </mc:AlternateContent>
+      </w:r>
+    </w:p>
+    <w:p>
+      <w:r>
+        <w:rPr>
+          <w:noProof/>
+        </w:rPr>
+        <w:drawing>
+          <wp:anchor distT="0" distB="0" distL="114300" distR="114300" simplePos="0" relativeHeight="251660288" behindDoc="0" locked="0" layoutInCell="1" allowOverlap="1" wp14:anchorId="75EEB4EF" wp14:editId="12B4CF3F">
+            <wp:simplePos x="0" y="0"/>
+            <wp:positionH relativeFrom="margin">
+              <wp:align>right</wp:align>
+            </wp:positionH>
+            <wp:positionV relativeFrom="paragraph">
+              <wp:posOffset>8890</wp:posOffset>
+            </wp:positionV>
+            <wp:extent cx="1219200" cy="1219200"/>
+            <wp:effectExtent l="0" t="0" r="0" b="0"/>
+            <wp:wrapSquare wrapText="bothSides"/>
+            <wp:docPr id="514786697" name="Picture 2" descr="A black swirly design on a white background&#10;&#10;AI-generated content may be incorrect."/>
+            <wp:cNvGraphicFramePr>
+              <a:graphicFrameLocks xmlns:a="http://schemas.openxmlformats.org/drawingml/2006/main" noChangeAspect="1"/>
+            </wp:cNvGraphicFramePr>
+            <a:graphic xmlns:a="http://schemas.openxmlformats.org/drawingml/2006/main">
+              <a:graphicData uri="http://schemas.openxmlformats.org/drawingml/2006/picture">
+                <pic:pic xmlns:pic="http://schemas.openxmlformats.org/drawingml/2006/picture">
+                  <pic:nvPicPr>
+                    <pic:cNvPr id="514786697" name="Picture 2" descr="A black swirly design on a white background&#10;&#10;AI-generated content may be incorrect."/>
+                    <pic:cNvPicPr>
+                      <a:picLocks noChangeAspect="1" noChangeArrowheads="1"/>
+                    </pic:cNvPicPr>
+                  </pic:nvPicPr>
+                  <pic:blipFill>
+                    <a:blip r:embed="rId10">
+                      <a:extLst>
+                        <a:ext uri="{28A0092B-C50C-407E-A947-70E740481C1C}">
+                          <a14:useLocalDpi xmlns:a14="http://schemas.microsoft.com/office/drawing/2010/main" val="0"/>
+                        </a:ext>
+                      </a:extLst>
+                    </a:blip>
+                    <a:srcRect/>
+                    <a:stretch>
+                      <a:fillRect/>
+                    </a:stretch>
+                  </pic:blipFill>
+                  <pic:spPr bwMode="auto">
+                    <a:xfrm>
+                      <a:off x="0" y="0"/>
+                      <a:ext cx="1219200" cy="1219200"/>
+                    </a:xfrm>
+                    <a:prstGeom prst="rect">
+                      <a:avLst/>
+                    </a:prstGeom>
+                    <a:noFill/>
+                    <a:ln>
+                      <a:noFill/>
+                    </a:ln>
+                  </pic:spPr>
+                </pic:pic>
+              </a:graphicData>
+            </a:graphic>
+          </wp:anchor>
+        </w:drawing>
+      </w:r>
+      <w:r>
+        <w:t>Találtunk más „érdekes” karaktereket is, amik emberi szemmel nem nagyon lehet meghatározni. Érdekes lesz látni, hogy a modell hogyan fog ezekre reagálni és meg tudja-e tanulni azonosítani őket.</w:t>
+      </w:r>
+    </w:p>
+    <w:p>
+      <w:r>
+        <w:rPr>
+          <w:noProof/>
+        </w:rPr>
+        <mc:AlternateContent>
+          <mc:Choice Requires="wps">
+            <w:drawing>
+              <wp:anchor distT="0" distB="0" distL="114300" distR="114300" simplePos="0" relativeHeight="251664384" behindDoc="0" locked="0" layoutInCell="1" allowOverlap="1" wp14:anchorId="68C4EBE1" wp14:editId="57A62335">
+                <wp:simplePos x="0" y="0"/>
+                <wp:positionH relativeFrom="margin">
+                  <wp:posOffset>4724400</wp:posOffset>
+                </wp:positionH>
+                <wp:positionV relativeFrom="paragraph">
+                  <wp:posOffset>534035</wp:posOffset>
+                </wp:positionV>
+                <wp:extent cx="1219200" cy="142875"/>
+                <wp:effectExtent l="0" t="0" r="0" b="9525"/>
+                <wp:wrapSquare wrapText="bothSides"/>
+                <wp:docPr id="2102870784" name="Text Box 1"/>
+                <wp:cNvGraphicFramePr/>
+                <a:graphic xmlns:a="http://schemas.openxmlformats.org/drawingml/2006/main">
+                  <a:graphicData uri="http://schemas.microsoft.com/office/word/2010/wordprocessingShape">
+                    <wps:wsp>
+                      <wps:cNvSpPr txBox="1"/>
+                      <wps:spPr>
+                        <a:xfrm>
+                          <a:off x="0" y="0"/>
+                          <a:ext cx="1219200" cy="142875"/>
+                        </a:xfrm>
+                        <a:prstGeom prst="rect">
+                          <a:avLst/>
+                        </a:prstGeom>
+                        <a:noFill/>
+                        <a:ln>
+                          <a:noFill/>
+                        </a:ln>
+                      </wps:spPr>
+                      <wps:txbx>
+                        <w:txbxContent>
+                          <w:p>
+                            <w:pPr>
+                              <w:pStyle w:val="Caption"/>
+                              <w:jc w:val="center"/>
+                              <w:rPr>
+                                <w:noProof/>
+                              </w:rPr>
+                            </w:pPr>
+                            <w:r>
+                              <w:t>Érdekes L</w:t>
+                            </w:r>
+                          </w:p>
+                        </w:txbxContent>
+                      </wps:txbx>
+                      <wps:bodyPr rot="0" spcFirstLastPara="0" vertOverflow="overflow" horzOverflow="overflow" vert="horz" wrap="square" lIns="0" tIns="0" rIns="0" bIns="0" numCol="1" spcCol="0" rtlCol="0" fromWordArt="0" anchor="t" anchorCtr="0" forceAA="0" compatLnSpc="1">
+                        <a:prstTxWarp prst="textNoShape">
+                          <a:avLst/>
+                        </a:prstTxWarp>
+                        <a:noAutofit/>
+                      </wps:bodyPr>
+                    </wps:wsp>
+                  </a:graphicData>
+                </a:graphic>
+                <wp14:sizeRelV relativeFrom="margin">
+                  <wp14:pctHeight>0</wp14:pctHeight>
+                </wp14:sizeRelV>
+              </wp:anchor>
+            </w:drawing>
+          </mc:Choice>
+          <mc:Fallback>
+            <w:pict>
+              <v:shape w14:anchorId="68C4EBE1" id="_x0000_s1029" type="#_x0000_t202" style="position:absolute;margin-left:372pt;margin-top:42.05pt;width:96pt;height:11.25pt;z-index:251664384;visibility:visible;mso-wrap-style:square;mso-height-percent:0;mso-wrap-distance-left:9pt;mso-wrap-distance-top:0;mso-wrap-distance-right:9pt;mso-wrap-distance-bottom:0;mso-position-horizontal:absolute;mso-position-horizontal-relative:margin;mso-position-vertical:absolute;mso-position-vertical-relative:text;mso-height-percent:0;mso-height-relative:margin;v-text-anchor:top" o:gfxdata="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" filled="f" stroked="f">
+                <v:textbox inset="0,0,0,0">
+                  <w:txbxContent>
+                    <w:p>
+                      <w:pPr>
+                        <w:pStyle w:val="Caption"/>
+                        <w:jc w:val="center"/>
+                        <w:rPr>
+                          <w:noProof/>
+                        </w:rPr>
+                      </w:pPr>
+                      <w:r>
+                        <w:t>Érdekes L</w:t>
+                      </w:r>
+                    </w:p>
+                  </w:txbxContent>
+                </v:textbox>
+                <w10:wrap type="square" anchorx="margin"/>
+              </v:shape>
+            </w:pict>
+          </mc:Fallback>
+        </mc:AlternateContent>
+      </w:r>
+      <w:r>
+        <w:t>Az adathalmaz más szempontokból viszont igen kiváló, ugyanis a képek minősége rendkívül jó. Élesek, méretük azonos így ezen a téren nem kell rajtuk változtatni, vagy szűrni őket.</w:t>
+      </w:r>
+    </w:p>
+    <w:p>
+      <w:r>
+        <w:t>Emellett kaptunk még egy teszt adathalmazt is, melyek teljesen címkézetlenek. Ezt felhasználva fogjuk a projekt végén létrehozni a predikciós fájlunkat, ami alapján majd értékelhető lesz a modellünk.</w:t>
+      </w:r>
+    </w:p>
     <w:p>
       <w:r>
         <w:br w:type="page"/>
@@ -671,71 +1092,26 @@
           <w:numId w:val="3"/>
         </w:numPr>
         <w:ind w:left="990" w:hanging="630"/>
-        <w:rPr/>
-      </w:pPr>
-      <w:r>
-        <w:rPr/>
-        <w:t>Megvalósítás</w:t>
-      </w:r>
-      <w:r>
-        <w:rPr/>
-        <w:t xml:space="preserve"> </w:t>
-      </w:r>
-      <w:r>
-        <w:rPr/>
-        <w:t>lépései</w:t>
+      </w:pPr>
+      <w:r>
+        <w:lastRenderedPageBreak/>
+        <w:t>Megvalósítás lépései</w:t>
       </w:r>
     </w:p>
     <w:p/>
     <w:p>
       <w:r>
-        <w:rPr/>
-        <w:t>Shuffle Data</w:t>
-      </w:r>
-      <w:r>
-        <w:rPr/>
-        <w:t xml:space="preserve">, </w:t>
-      </w:r>
-      <w:r>
-        <w:rPr/>
+        <w:t xml:space="preserve">Shuffle Data, </w:t>
+      </w:r>
+      <w:r>
         <w:t>Cross-validation</w:t>
       </w:r>
       <w:r>
-        <w:rPr/>
-        <w:t xml:space="preserve">, </w:t>
-      </w:r>
-      <w:r>
-        <w:rPr/>
-        <w:t>Early Stopping</w:t>
-      </w:r>
-      <w:r>
-        <w:rPr/>
-        <w:t xml:space="preserve">, </w:t>
-      </w:r>
-      <w:r>
-        <w:rPr/>
-        <w:t>Dropout Regularization</w:t>
-      </w:r>
-      <w:r>
-        <w:rPr/>
-        <w:t xml:space="preserve">, </w:t>
-      </w:r>
-      <w:r>
-        <w:rPr/>
-        <w:t>L1/L2 Regularization</w:t>
-      </w:r>
-      <w:r>
-        <w:rPr/>
-        <w:t>(?),</w:t>
+        <w:t>, Early Stopping, Dropout Regularization, L1/L2 Regularization(?),</w:t>
       </w:r>
     </w:p>
     <w:p/>
     <w:p>
-      <w:pPr>
-        <w:rPr>
-          <w:lang w:val="hu-HU"/>
-        </w:rPr>
-      </w:pPr>
       <w:r>
         <w:br w:type="page"/>
       </w:r>
@@ -747,10 +1123,9 @@
           <w:ilvl w:val="0"/>
           <w:numId w:val="3"/>
         </w:numPr>
-        <w:rPr/>
-      </w:pPr>
-      <w:r>
-        <w:rPr/>
+      </w:pPr>
+      <w:r>
+        <w:lastRenderedPageBreak/>
         <w:t>Eredmények</w:t>
       </w:r>
     </w:p>
@@ -769,7 +1144,7 @@
         <w:br w:type="page"/>
       </w:r>
       <w:r>
-        <w:rPr/>
+        <w:lastRenderedPageBreak/>
         <w:t>Konklúzió</w:t>
       </w:r>
     </w:p>
@@ -780,18 +1155,13 @@
           <w:ilvl w:val="0"/>
           <w:numId w:val="3"/>
         </w:numPr>
-        <w:rPr/>
       </w:pPr>
       <w:r>
         <w:br w:type="page"/>
       </w:r>
       <w:r>
-        <w:rPr/>
-        <w:t>Kontribúció</w:t>
-      </w:r>
-      <w:r>
-        <w:rPr/>
-        <w:t xml:space="preserve"> </w:t>
+        <w:lastRenderedPageBreak/>
+        <w:t xml:space="preserve">Kontribúció </w:t>
       </w:r>
       <w:r>
         <w:rPr>
@@ -803,7 +1173,7 @@
     <w:p>
       <w:pPr>
         <w:rPr>
-          <w:rFonts w:ascii="Aptos Display" w:hAnsi="Aptos Display" w:eastAsia="" w:cs="Times New Roman" w:asciiTheme="majorAscii" w:hAnsiTheme="majorAscii" w:eastAsiaTheme="majorEastAsia" w:cstheme="majorBidi"/>
+          <w:rFonts w:asciiTheme="majorHAnsi" w:eastAsiaTheme="majorEastAsia" w:hAnsiTheme="majorHAnsi" w:cstheme="majorBidi"/>
           <w:sz w:val="44"/>
           <w:szCs w:val="44"/>
         </w:rPr>
@@ -824,42 +1194,26 @@
           <w:tab w:val="left" w:pos="990"/>
           <w:tab w:val="left" w:pos="1170"/>
         </w:tabs>
-        <w:ind/>
-        <w:rPr/>
-      </w:pPr>
-      <w:r>
-        <w:rPr/>
-        <w:t>Irodalomjegy</w:t>
-      </w:r>
-      <w:r>
-        <w:rPr/>
-        <w:t>zék</w:t>
-      </w:r>
-    </w:p>
-    <w:p>
-      <w:pPr>
-        <w:pStyle w:val="Normal"/>
+      </w:pPr>
+      <w:r>
+        <w:lastRenderedPageBreak/>
+        <w:t>Irodalomjegyzék</w:t>
+      </w:r>
+    </w:p>
+    <w:p>
+      <w:pPr>
         <w:tabs>
-          <w:tab w:val="left" w:leader="none" w:pos="810"/>
-          <w:tab w:val="left" w:leader="none" w:pos="990"/>
-          <w:tab w:val="left" w:leader="none" w:pos="1170"/>
+          <w:tab w:val="left" w:pos="810"/>
+          <w:tab w:val="left" w:pos="990"/>
+          <w:tab w:val="left" w:pos="1170"/>
         </w:tabs>
       </w:pPr>
     </w:p>
     <w:p>
-      <w:pPr>
-        <w:pStyle w:val="Normal"/>
-        <w:ind w:left="0"/>
-        <w:rPr>
-          <w:sz w:val="24"/>
-          <w:szCs w:val="24"/>
-        </w:rPr>
-      </w:pPr>
-      <w:r>
-        <w:rPr/>
+      <w:r>
         <w:t xml:space="preserve">1: </w:t>
       </w:r>
-      <w:hyperlink r:id="Rc8494507c99c4f4f">
+      <w:hyperlink r:id="rId11">
         <w:r>
           <w:rPr>
             <w:rStyle w:val="Hyperlink"/>
@@ -869,19 +1223,13 @@
       </w:hyperlink>
     </w:p>
     <w:p>
-      <w:pPr>
-        <w:pStyle w:val="Normal"/>
-        <w:ind w:left="0"/>
-      </w:pPr>
-      <w:r>
-        <w:rPr/>
+      <w:r>
         <w:t>2:</w:t>
       </w:r>
       <w:r>
-        <w:rPr/>
         <w:t xml:space="preserve"> </w:t>
       </w:r>
-      <w:hyperlink r:id="Rc29ef6c703f24e91">
+      <w:hyperlink r:id="rId12">
         <w:r>
           <w:rPr>
             <w:rStyle w:val="Hyperlink"/>
@@ -893,7 +1241,7 @@
     <w:p/>
     <w:p/>
     <w:sectPr>
-      <w:pgSz w:w="12240" w:h="15840" w:orient="portrait"/>
+      <w:pgSz w:w="12240" w:h="15840"/>
       <w:pgMar w:top="1440" w:right="1440" w:bottom="1440" w:left="1440" w:header="720" w:footer="720" w:gutter="0"/>
       <w:cols w:space="720"/>
       <w:docGrid w:linePitch="360"/>
@@ -917,7 +1265,7 @@
         <w:ind w:left="720" w:hanging="360"/>
       </w:pPr>
       <w:rPr>
-        <w:rFonts w:hint="default" w:ascii="Symbol" w:hAnsi="Symbol"/>
+        <w:rFonts w:ascii="Symbol" w:hAnsi="Symbol" w:hint="default"/>
       </w:rPr>
     </w:lvl>
     <w:lvl w:ilvl="1" w:tplc="04090003" w:tentative="1">
@@ -929,7 +1277,7 @@
         <w:ind w:left="1440" w:hanging="360"/>
       </w:pPr>
       <w:rPr>
-        <w:rFonts w:hint="default" w:ascii="Courier New" w:hAnsi="Courier New" w:cs="Courier New"/>
+        <w:rFonts w:ascii="Courier New" w:hAnsi="Courier New" w:cs="Courier New" w:hint="default"/>
       </w:rPr>
     </w:lvl>
     <w:lvl w:ilvl="2" w:tplc="04090005" w:tentative="1">
@@ -941,7 +1289,7 @@
         <w:ind w:left="2160" w:hanging="360"/>
       </w:pPr>
       <w:rPr>
-        <w:rFonts w:hint="default" w:ascii="Wingdings" w:hAnsi="Wingdings"/>
+        <w:rFonts w:ascii="Wingdings" w:hAnsi="Wingdings" w:hint="default"/>
       </w:rPr>
     </w:lvl>
     <w:lvl w:ilvl="3" w:tplc="04090001" w:tentative="1">
@@ -953,7 +1301,7 @@
         <w:ind w:left="2880" w:hanging="360"/>
       </w:pPr>
       <w:rPr>
-        <w:rFonts w:hint="default" w:ascii="Symbol" w:hAnsi="Symbol"/>
+        <w:rFonts w:ascii="Symbol" w:hAnsi="Symbol" w:hint="default"/>
       </w:rPr>
     </w:lvl>
     <w:lvl w:ilvl="4" w:tplc="04090003" w:tentative="1">
@@ -965,7 +1313,7 @@
         <w:ind w:left="3600" w:hanging="360"/>
       </w:pPr>
       <w:rPr>
-        <w:rFonts w:hint="default" w:ascii="Courier New" w:hAnsi="Courier New" w:cs="Courier New"/>
+        <w:rFonts w:ascii="Courier New" w:hAnsi="Courier New" w:cs="Courier New" w:hint="default"/>
       </w:rPr>
     </w:lvl>
     <w:lvl w:ilvl="5" w:tplc="04090005" w:tentative="1">
@@ -977,7 +1325,7 @@
         <w:ind w:left="4320" w:hanging="360"/>
       </w:pPr>
       <w:rPr>
-        <w:rFonts w:hint="default" w:ascii="Wingdings" w:hAnsi="Wingdings"/>
+        <w:rFonts w:ascii="Wingdings" w:hAnsi="Wingdings" w:hint="default"/>
       </w:rPr>
     </w:lvl>
     <w:lvl w:ilvl="6" w:tplc="04090001" w:tentative="1">
@@ -989,7 +1337,7 @@
         <w:ind w:left="5040" w:hanging="360"/>
       </w:pPr>
       <w:rPr>
-        <w:rFonts w:hint="default" w:ascii="Symbol" w:hAnsi="Symbol"/>
+        <w:rFonts w:ascii="Symbol" w:hAnsi="Symbol" w:hint="default"/>
       </w:rPr>
     </w:lvl>
     <w:lvl w:ilvl="7" w:tplc="04090003" w:tentative="1">
@@ -1001,7 +1349,7 @@
         <w:ind w:left="5760" w:hanging="360"/>
       </w:pPr>
       <w:rPr>
-        <w:rFonts w:hint="default" w:ascii="Courier New" w:hAnsi="Courier New" w:cs="Courier New"/>
+        <w:rFonts w:ascii="Courier New" w:hAnsi="Courier New" w:cs="Courier New" w:hint="default"/>
       </w:rPr>
     </w:lvl>
     <w:lvl w:ilvl="8" w:tplc="04090005" w:tentative="1">
@@ -1013,7 +1361,7 @@
         <w:ind w:left="6480" w:hanging="360"/>
       </w:pPr>
       <w:rPr>
-        <w:rFonts w:hint="default" w:ascii="Wingdings" w:hAnsi="Wingdings"/>
+        <w:rFonts w:ascii="Wingdings" w:hAnsi="Wingdings" w:hint="default"/>
       </w:rPr>
     </w:lvl>
   </w:abstractNum>
@@ -1206,7 +1554,7 @@
   <w:docDefaults>
     <w:rPrDefault>
       <w:rPr>
-        <w:rFonts w:asciiTheme="minorHAnsi" w:hAnsiTheme="minorHAnsi" w:eastAsiaTheme="minorHAnsi" w:cstheme="minorBidi"/>
+        <w:rFonts w:asciiTheme="minorHAnsi" w:eastAsiaTheme="minorHAnsi" w:hAnsiTheme="minorHAnsi" w:cstheme="minorBidi"/>
         <w:kern w:val="2"/>
         <w:sz w:val="24"/>
         <w:szCs w:val="24"/>
@@ -1223,14 +1571,14 @@
   <w:latentStyles w:defLockedState="0" w:defUIPriority="99" w:defSemiHidden="0" w:defUnhideWhenUsed="0" w:defQFormat="0" w:count="376">
     <w:lsdException w:name="Normal" w:uiPriority="0" w:qFormat="1"/>
     <w:lsdException w:name="heading 1" w:uiPriority="9" w:qFormat="1"/>
-    <w:lsdException w:name="heading 2" w:uiPriority="9" w:semiHidden="1" w:unhideWhenUsed="1" w:qFormat="1"/>
-    <w:lsdException w:name="heading 3" w:uiPriority="9" w:semiHidden="1" w:unhideWhenUsed="1" w:qFormat="1"/>
-    <w:lsdException w:name="heading 4" w:uiPriority="9" w:semiHidden="1" w:unhideWhenUsed="1" w:qFormat="1"/>
-    <w:lsdException w:name="heading 5" w:uiPriority="9" w:semiHidden="1" w:unhideWhenUsed="1" w:qFormat="1"/>
-    <w:lsdException w:name="heading 6" w:uiPriority="9" w:semiHidden="1" w:unhideWhenUsed="1" w:qFormat="1"/>
-    <w:lsdException w:name="heading 7" w:uiPriority="9" w:semiHidden="1" w:unhideWhenUsed="1" w:qFormat="1"/>
-    <w:lsdException w:name="heading 8" w:uiPriority="9" w:semiHidden="1" w:unhideWhenUsed="1" w:qFormat="1"/>
-    <w:lsdException w:name="heading 9" w:uiPriority="9" w:semiHidden="1" w:unhideWhenUsed="1" w:qFormat="1"/>
+    <w:lsdException w:name="heading 2" w:semiHidden="1" w:uiPriority="9" w:unhideWhenUsed="1" w:qFormat="1"/>
+    <w:lsdException w:name="heading 3" w:semiHidden="1" w:uiPriority="9" w:unhideWhenUsed="1" w:qFormat="1"/>
+    <w:lsdException w:name="heading 4" w:semiHidden="1" w:uiPriority="9" w:unhideWhenUsed="1" w:qFormat="1"/>
+    <w:lsdException w:name="heading 5" w:semiHidden="1" w:uiPriority="9" w:unhideWhenUsed="1" w:qFormat="1"/>
+    <w:lsdException w:name="heading 6" w:semiHidden="1" w:uiPriority="9" w:unhideWhenUsed="1" w:qFormat="1"/>
+    <w:lsdException w:name="heading 7" w:semiHidden="1" w:uiPriority="9" w:unhideWhenUsed="1" w:qFormat="1"/>
+    <w:lsdException w:name="heading 8" w:semiHidden="1" w:uiPriority="9" w:unhideWhenUsed="1" w:qFormat="1"/>
+    <w:lsdException w:name="heading 9" w:semiHidden="1" w:uiPriority="9" w:unhideWhenUsed="1" w:qFormat="1"/>
     <w:lsdException w:name="index 1" w:semiHidden="1" w:unhideWhenUsed="1"/>
     <w:lsdException w:name="index 2" w:semiHidden="1" w:unhideWhenUsed="1"/>
     <w:lsdException w:name="index 3" w:semiHidden="1" w:unhideWhenUsed="1"/>
@@ -1240,22 +1588,22 @@
     <w:lsdException w:name="index 7" w:semiHidden="1" w:unhideWhenUsed="1"/>
     <w:lsdException w:name="index 8" w:semiHidden="1" w:unhideWhenUsed="1"/>
     <w:lsdException w:name="index 9" w:semiHidden="1" w:unhideWhenUsed="1"/>
-    <w:lsdException w:name="toc 1" w:uiPriority="39" w:semiHidden="1" w:unhideWhenUsed="1"/>
-    <w:lsdException w:name="toc 2" w:uiPriority="39" w:semiHidden="1" w:unhideWhenUsed="1"/>
-    <w:lsdException w:name="toc 3" w:uiPriority="39" w:semiHidden="1" w:unhideWhenUsed="1"/>
-    <w:lsdException w:name="toc 4" w:uiPriority="39" w:semiHidden="1" w:unhideWhenUsed="1"/>
-    <w:lsdException w:name="toc 5" w:uiPriority="39" w:semiHidden="1" w:unhideWhenUsed="1"/>
-    <w:lsdException w:name="toc 6" w:uiPriority="39" w:semiHidden="1" w:unhideWhenUsed="1"/>
-    <w:lsdException w:name="toc 7" w:uiPriority="39" w:semiHidden="1" w:unhideWhenUsed="1"/>
-    <w:lsdException w:name="toc 8" w:uiPriority="39" w:semiHidden="1" w:unhideWhenUsed="1"/>
-    <w:lsdException w:name="toc 9" w:uiPriority="39" w:semiHidden="1" w:unhideWhenUsed="1"/>
+    <w:lsdException w:name="toc 1" w:semiHidden="1" w:uiPriority="39" w:unhideWhenUsed="1"/>
+    <w:lsdException w:name="toc 2" w:semiHidden="1" w:uiPriority="39" w:unhideWhenUsed="1"/>
+    <w:lsdException w:name="toc 3" w:semiHidden="1" w:uiPriority="39" w:unhideWhenUsed="1"/>
+    <w:lsdException w:name="toc 4" w:semiHidden="1" w:uiPriority="39" w:unhideWhenUsed="1"/>
+    <w:lsdException w:name="toc 5" w:semiHidden="1" w:uiPriority="39" w:unhideWhenUsed="1"/>
+    <w:lsdException w:name="toc 6" w:semiHidden="1" w:uiPriority="39" w:unhideWhenUsed="1"/>
+    <w:lsdException w:name="toc 7" w:semiHidden="1" w:uiPriority="39" w:unhideWhenUsed="1"/>
+    <w:lsdException w:name="toc 8" w:semiHidden="1" w:uiPriority="39" w:unhideWhenUsed="1"/>
+    <w:lsdException w:name="toc 9" w:semiHidden="1" w:uiPriority="39" w:unhideWhenUsed="1"/>
     <w:lsdException w:name="Normal Indent" w:semiHidden="1" w:unhideWhenUsed="1"/>
     <w:lsdException w:name="footnote text" w:semiHidden="1" w:unhideWhenUsed="1"/>
     <w:lsdException w:name="annotation text" w:semiHidden="1" w:unhideWhenUsed="1"/>
     <w:lsdException w:name="header" w:semiHidden="1" w:unhideWhenUsed="1"/>
     <w:lsdException w:name="footer" w:semiHidden="1" w:unhideWhenUsed="1"/>
     <w:lsdException w:name="index heading" w:semiHidden="1" w:unhideWhenUsed="1"/>
-    <w:lsdException w:name="caption" w:uiPriority="35" w:semiHidden="1" w:unhideWhenUsed="1" w:qFormat="1"/>
+    <w:lsdException w:name="caption" w:semiHidden="1" w:uiPriority="35" w:unhideWhenUsed="1" w:qFormat="1"/>
     <w:lsdException w:name="table of figures" w:semiHidden="1" w:unhideWhenUsed="1"/>
     <w:lsdException w:name="envelope address" w:semiHidden="1" w:unhideWhenUsed="1"/>
     <w:lsdException w:name="envelope return" w:semiHidden="1" w:unhideWhenUsed="1"/>
@@ -1286,7 +1634,7 @@
     <w:lsdException w:name="Title" w:uiPriority="10" w:qFormat="1"/>
     <w:lsdException w:name="Closing" w:semiHidden="1" w:unhideWhenUsed="1"/>
     <w:lsdException w:name="Signature" w:semiHidden="1" w:unhideWhenUsed="1"/>
-    <w:lsdException w:name="Default Paragraph Font" w:uiPriority="1" w:semiHidden="1" w:unhideWhenUsed="1"/>
+    <w:lsdException w:name="Default Paragraph Font" w:semiHidden="1" w:uiPriority="1" w:unhideWhenUsed="1"/>
     <w:lsdException w:name="Body Text" w:semiHidden="1" w:unhideWhenUsed="1"/>
     <w:lsdException w:name="Body Text Indent" w:semiHidden="1" w:unhideWhenUsed="1"/>
     <w:lsdException w:name="List Continue" w:semiHidden="1" w:unhideWhenUsed="1"/>
@@ -1486,8 +1834,8 @@
     <w:lsdException w:name="Subtle Reference" w:uiPriority="31" w:qFormat="1"/>
     <w:lsdException w:name="Intense Reference" w:uiPriority="32" w:qFormat="1"/>
     <w:lsdException w:name="Book Title" w:uiPriority="33" w:qFormat="1"/>
-    <w:lsdException w:name="Bibliography" w:uiPriority="37" w:semiHidden="1" w:unhideWhenUsed="1"/>
-    <w:lsdException w:name="TOC Heading" w:uiPriority="39" w:semiHidden="1" w:unhideWhenUsed="1" w:qFormat="1"/>
+    <w:lsdException w:name="Bibliography" w:semiHidden="1" w:uiPriority="37" w:unhideWhenUsed="1"/>
+    <w:lsdException w:name="TOC Heading" w:semiHidden="1" w:uiPriority="39" w:unhideWhenUsed="1" w:qFormat="1"/>
     <w:lsdException w:name="Plain Table 1" w:uiPriority="41"/>
     <w:lsdException w:name="Plain Table 2" w:uiPriority="42"/>
     <w:lsdException w:name="Plain Table 3" w:uiPriority="43"/>
@@ -1598,218 +1946,217 @@
     <w:lsdException w:name="Unresolved Mention" w:semiHidden="1" w:unhideWhenUsed="1"/>
     <w:lsdException w:name="Smart Link" w:semiHidden="1" w:unhideWhenUsed="1"/>
   </w:latentStyles>
-  <w:style w:type="paragraph" w:styleId="Normal" w:default="1">
-    <w:uiPriority w:val="0"/>
+  <w:style w:type="paragraph" w:default="1" w:styleId="Normal">
     <w:name w:val="Normal"/>
     <w:qFormat/>
     <w:rsid w:val="2DE20F6E"/>
     <w:rPr>
-      <w:noProof w:val="0"/>
       <w:lang w:val="hu-HU"/>
     </w:rPr>
   </w:style>
   <w:style w:type="paragraph" w:styleId="Heading1">
-    <w:uiPriority w:val="9"/>
     <w:name w:val="heading 1"/>
     <w:basedOn w:val="Normal"/>
     <w:next w:val="Normal"/>
     <w:link w:val="Heading1Char"/>
+    <w:uiPriority w:val="9"/>
     <w:qFormat/>
     <w:rsid w:val="2DE20F6E"/>
-    <w:rPr>
-      <w:rFonts w:ascii="Aptos Display" w:hAnsi="Aptos Display" w:eastAsia="" w:cs="Times New Roman" w:asciiTheme="majorAscii" w:hAnsiTheme="majorAscii" w:eastAsiaTheme="majorEastAsia" w:cstheme="majorBidi"/>
-      <w:sz w:val="40"/>
-      <w:szCs w:val="40"/>
-    </w:rPr>
     <w:pPr>
-      <w:keepNext w:val="1"/>
-      <w:keepLines w:val="1"/>
+      <w:keepNext/>
+      <w:keepLines/>
       <w:spacing w:before="360" w:after="80"/>
       <w:outlineLvl w:val="0"/>
     </w:pPr>
+    <w:rPr>
+      <w:rFonts w:asciiTheme="majorHAnsi" w:eastAsiaTheme="majorEastAsia" w:hAnsiTheme="majorHAnsi" w:cstheme="majorBidi"/>
+      <w:sz w:val="40"/>
+      <w:szCs w:val="40"/>
+    </w:rPr>
   </w:style>
   <w:style w:type="paragraph" w:styleId="Heading2">
-    <w:uiPriority w:val="9"/>
     <w:name w:val="heading 2"/>
     <w:basedOn w:val="Normal"/>
     <w:next w:val="Normal"/>
+    <w:link w:val="Heading2Char"/>
+    <w:uiPriority w:val="9"/>
     <w:unhideWhenUsed/>
-    <w:link w:val="Heading2Char"/>
     <w:qFormat/>
     <w:rsid w:val="2DE20F6E"/>
-    <w:rPr>
-      <w:rFonts w:ascii="Aptos Display" w:hAnsi="Aptos Display" w:eastAsia="" w:cs="Times New Roman" w:asciiTheme="majorAscii" w:hAnsiTheme="majorAscii" w:eastAsiaTheme="majorEastAsia" w:cstheme="majorBidi"/>
-      <w:sz w:val="44"/>
-      <w:szCs w:val="44"/>
-    </w:rPr>
     <w:pPr>
-      <w:keepNext w:val="1"/>
-      <w:keepLines w:val="1"/>
+      <w:keepNext/>
+      <w:keepLines/>
       <w:spacing w:before="160" w:after="80"/>
       <w:outlineLvl w:val="1"/>
     </w:pPr>
+    <w:rPr>
+      <w:rFonts w:asciiTheme="majorHAnsi" w:eastAsiaTheme="majorEastAsia" w:hAnsiTheme="majorHAnsi" w:cstheme="majorBidi"/>
+      <w:sz w:val="44"/>
+      <w:szCs w:val="44"/>
+    </w:rPr>
   </w:style>
   <w:style w:type="paragraph" w:styleId="Heading3">
-    <w:uiPriority w:val="9"/>
     <w:name w:val="heading 3"/>
     <w:basedOn w:val="Normal"/>
     <w:next w:val="Normal"/>
+    <w:link w:val="Heading3Char"/>
+    <w:uiPriority w:val="9"/>
     <w:semiHidden/>
     <w:unhideWhenUsed/>
-    <w:link w:val="Heading3Char"/>
     <w:qFormat/>
     <w:rsid w:val="2DE20F6E"/>
-    <w:rPr>
-      <w:rFonts w:eastAsia="" w:cs="Times New Roman" w:eastAsiaTheme="majorEastAsia" w:cstheme="majorBidi"/>
-      <w:color w:val="0F4761" w:themeColor="accent1" w:themeTint="FF" w:themeShade="BF"/>
-      <w:sz w:val="28"/>
-      <w:szCs w:val="28"/>
-    </w:rPr>
     <w:pPr>
-      <w:keepNext w:val="1"/>
-      <w:keepLines w:val="1"/>
+      <w:keepNext/>
+      <w:keepLines/>
       <w:spacing w:before="160" w:after="80"/>
       <w:outlineLvl w:val="2"/>
     </w:pPr>
+    <w:rPr>
+      <w:rFonts w:eastAsiaTheme="majorEastAsia" w:cstheme="majorBidi"/>
+      <w:color w:val="0F4761" w:themeColor="accent1" w:themeShade="BF"/>
+      <w:sz w:val="28"/>
+      <w:szCs w:val="28"/>
+    </w:rPr>
   </w:style>
   <w:style w:type="paragraph" w:styleId="Heading4">
-    <w:uiPriority w:val="9"/>
     <w:name w:val="heading 4"/>
     <w:basedOn w:val="Normal"/>
     <w:next w:val="Normal"/>
+    <w:link w:val="Heading4Char"/>
+    <w:uiPriority w:val="9"/>
     <w:semiHidden/>
     <w:unhideWhenUsed/>
-    <w:link w:val="Heading4Char"/>
     <w:qFormat/>
     <w:rsid w:val="2DE20F6E"/>
-    <w:rPr>
-      <w:rFonts w:eastAsia="" w:cs="Times New Roman" w:eastAsiaTheme="majorEastAsia" w:cstheme="majorBidi"/>
-      <w:i w:val="1"/>
-      <w:iCs w:val="1"/>
-      <w:color w:val="0F4761" w:themeColor="accent1" w:themeTint="FF" w:themeShade="BF"/>
-    </w:rPr>
     <w:pPr>
-      <w:keepNext w:val="1"/>
-      <w:keepLines w:val="1"/>
+      <w:keepNext/>
+      <w:keepLines/>
       <w:spacing w:before="80" w:after="40"/>
       <w:outlineLvl w:val="3"/>
     </w:pPr>
+    <w:rPr>
+      <w:rFonts w:eastAsiaTheme="majorEastAsia" w:cstheme="majorBidi"/>
+      <w:i/>
+      <w:iCs/>
+      <w:color w:val="0F4761" w:themeColor="accent1" w:themeShade="BF"/>
+    </w:rPr>
   </w:style>
   <w:style w:type="paragraph" w:styleId="Heading5">
-    <w:uiPriority w:val="9"/>
     <w:name w:val="heading 5"/>
     <w:basedOn w:val="Normal"/>
     <w:next w:val="Normal"/>
+    <w:link w:val="Heading5Char"/>
+    <w:uiPriority w:val="9"/>
     <w:semiHidden/>
     <w:unhideWhenUsed/>
-    <w:link w:val="Heading5Char"/>
     <w:qFormat/>
     <w:rsid w:val="2DE20F6E"/>
-    <w:rPr>
-      <w:rFonts w:eastAsia="" w:cs="Times New Roman" w:eastAsiaTheme="majorEastAsia" w:cstheme="majorBidi"/>
-      <w:color w:val="0F4761" w:themeColor="accent1" w:themeTint="FF" w:themeShade="BF"/>
-    </w:rPr>
     <w:pPr>
-      <w:keepNext w:val="1"/>
-      <w:keepLines w:val="1"/>
+      <w:keepNext/>
+      <w:keepLines/>
       <w:spacing w:before="80" w:after="40"/>
       <w:outlineLvl w:val="4"/>
     </w:pPr>
+    <w:rPr>
+      <w:rFonts w:eastAsiaTheme="majorEastAsia" w:cstheme="majorBidi"/>
+      <w:color w:val="0F4761" w:themeColor="accent1" w:themeShade="BF"/>
+    </w:rPr>
   </w:style>
   <w:style w:type="paragraph" w:styleId="Heading6">
-    <w:uiPriority w:val="9"/>
     <w:name w:val="heading 6"/>
     <w:basedOn w:val="Normal"/>
     <w:next w:val="Normal"/>
+    <w:link w:val="Heading6Char"/>
+    <w:uiPriority w:val="9"/>
     <w:semiHidden/>
     <w:unhideWhenUsed/>
-    <w:link w:val="Heading6Char"/>
     <w:qFormat/>
     <w:rsid w:val="2DE20F6E"/>
-    <w:rPr>
-      <w:rFonts w:eastAsia="" w:cs="Times New Roman" w:eastAsiaTheme="majorEastAsia" w:cstheme="majorBidi"/>
-      <w:i w:val="1"/>
-      <w:iCs w:val="1"/>
-      <w:color w:val="595959" w:themeColor="text1" w:themeTint="A6" w:themeShade="FF"/>
-    </w:rPr>
     <w:pPr>
-      <w:keepNext w:val="1"/>
-      <w:keepLines w:val="1"/>
+      <w:keepNext/>
+      <w:keepLines/>
       <w:spacing w:before="40" w:after="0"/>
       <w:outlineLvl w:val="5"/>
     </w:pPr>
+    <w:rPr>
+      <w:rFonts w:eastAsiaTheme="majorEastAsia" w:cstheme="majorBidi"/>
+      <w:i/>
+      <w:iCs/>
+      <w:color w:val="595959" w:themeColor="text1" w:themeTint="A6"/>
+    </w:rPr>
   </w:style>
   <w:style w:type="paragraph" w:styleId="Heading7">
-    <w:uiPriority w:val="9"/>
     <w:name w:val="heading 7"/>
     <w:basedOn w:val="Normal"/>
     <w:next w:val="Normal"/>
+    <w:link w:val="Heading7Char"/>
+    <w:uiPriority w:val="9"/>
     <w:semiHidden/>
     <w:unhideWhenUsed/>
-    <w:link w:val="Heading7Char"/>
     <w:qFormat/>
     <w:rsid w:val="2DE20F6E"/>
-    <w:rPr>
-      <w:rFonts w:eastAsia="" w:cs="Times New Roman" w:eastAsiaTheme="majorEastAsia" w:cstheme="majorBidi"/>
-      <w:color w:val="595959" w:themeColor="text1" w:themeTint="A6" w:themeShade="FF"/>
-    </w:rPr>
     <w:pPr>
-      <w:keepNext w:val="1"/>
-      <w:keepLines w:val="1"/>
+      <w:keepNext/>
+      <w:keepLines/>
       <w:spacing w:before="40" w:after="0"/>
       <w:outlineLvl w:val="6"/>
     </w:pPr>
+    <w:rPr>
+      <w:rFonts w:eastAsiaTheme="majorEastAsia" w:cstheme="majorBidi"/>
+      <w:color w:val="595959" w:themeColor="text1" w:themeTint="A6"/>
+    </w:rPr>
   </w:style>
   <w:style w:type="paragraph" w:styleId="Heading8">
-    <w:uiPriority w:val="9"/>
     <w:name w:val="heading 8"/>
     <w:basedOn w:val="Normal"/>
     <w:next w:val="Normal"/>
+    <w:link w:val="Heading8Char"/>
+    <w:uiPriority w:val="9"/>
     <w:semiHidden/>
     <w:unhideWhenUsed/>
-    <w:link w:val="Heading8Char"/>
     <w:qFormat/>
     <w:rsid w:val="2DE20F6E"/>
-    <w:rPr>
-      <w:rFonts w:eastAsia="" w:cs="Times New Roman" w:eastAsiaTheme="majorEastAsia" w:cstheme="majorBidi"/>
-      <w:i w:val="1"/>
-      <w:iCs w:val="1"/>
-      <w:color w:val="272727"/>
-    </w:rPr>
     <w:pPr>
-      <w:keepNext w:val="1"/>
-      <w:keepLines w:val="1"/>
+      <w:keepNext/>
+      <w:keepLines/>
       <w:spacing w:after="0"/>
       <w:outlineLvl w:val="7"/>
     </w:pPr>
+    <w:rPr>
+      <w:rFonts w:eastAsiaTheme="majorEastAsia" w:cstheme="majorBidi"/>
+      <w:i/>
+      <w:iCs/>
+      <w:color w:val="272727"/>
+    </w:rPr>
   </w:style>
   <w:style w:type="paragraph" w:styleId="Heading9">
-    <w:uiPriority w:val="9"/>
     <w:name w:val="heading 9"/>
     <w:basedOn w:val="Normal"/>
     <w:next w:val="Normal"/>
+    <w:link w:val="Heading9Char"/>
+    <w:uiPriority w:val="9"/>
     <w:semiHidden/>
     <w:unhideWhenUsed/>
-    <w:link w:val="Heading9Char"/>
     <w:qFormat/>
     <w:rsid w:val="2DE20F6E"/>
-    <w:rPr>
-      <w:rFonts w:eastAsia="" w:cs="Times New Roman" w:eastAsiaTheme="majorEastAsia" w:cstheme="majorBidi"/>
-      <w:color w:val="272727"/>
-    </w:rPr>
     <w:pPr>
-      <w:keepNext w:val="1"/>
-      <w:keepLines w:val="1"/>
+      <w:keepNext/>
+      <w:keepLines/>
       <w:spacing w:after="0"/>
       <w:outlineLvl w:val="8"/>
     </w:pPr>
-  </w:style>
-  <w:style w:type="character" w:styleId="DefaultParagraphFont" w:default="1">
+    <w:rPr>
+      <w:rFonts w:eastAsiaTheme="majorEastAsia" w:cstheme="majorBidi"/>
+      <w:color w:val="272727"/>
+    </w:rPr>
+  </w:style>
+  <w:style w:type="character" w:default="1" w:styleId="DefaultParagraphFont">
     <w:name w:val="Default Paragraph Font"/>
     <w:uiPriority w:val="1"/>
+    <w:semiHidden/>
     <w:unhideWhenUsed/>
   </w:style>
-  <w:style w:type="table" w:styleId="TableNormal" w:default="1">
+  <w:style w:type="table" w:default="1" w:styleId="TableNormal">
     <w:name w:val="Normal Table"/>
     <w:uiPriority w:val="99"/>
     <w:semiHidden/>
@@ -1824,37 +2171,37 @@
       </w:tblCellMar>
     </w:tblPr>
   </w:style>
-  <w:style w:type="numbering" w:styleId="NoList" w:default="1">
+  <w:style w:type="numbering" w:default="1" w:styleId="NoList">
     <w:name w:val="No List"/>
     <w:uiPriority w:val="99"/>
     <w:semiHidden/>
     <w:unhideWhenUsed/>
   </w:style>
-  <w:style w:type="character" w:styleId="Heading1Char" w:customStyle="1">
+  <w:style w:type="character" w:customStyle="1" w:styleId="Heading1Char">
     <w:name w:val="Heading 1 Char"/>
     <w:basedOn w:val="DefaultParagraphFont"/>
     <w:link w:val="Heading1"/>
     <w:uiPriority w:val="9"/>
     <w:rsid w:val="00775007"/>
     <w:rPr>
-      <w:rFonts w:asciiTheme="majorHAnsi" w:hAnsiTheme="majorHAnsi" w:eastAsiaTheme="majorEastAsia" w:cstheme="majorBidi"/>
+      <w:rFonts w:asciiTheme="majorHAnsi" w:eastAsiaTheme="majorEastAsia" w:hAnsiTheme="majorHAnsi" w:cstheme="majorBidi"/>
       <w:sz w:val="40"/>
       <w:szCs w:val="40"/>
     </w:rPr>
   </w:style>
-  <w:style w:type="character" w:styleId="Heading2Char" w:customStyle="1">
+  <w:style w:type="character" w:customStyle="1" w:styleId="Heading2Char">
     <w:name w:val="Heading 2 Char"/>
     <w:basedOn w:val="DefaultParagraphFont"/>
     <w:link w:val="Heading2"/>
     <w:uiPriority w:val="9"/>
     <w:rsid w:val="000D1B56"/>
     <w:rPr>
-      <w:rFonts w:asciiTheme="majorHAnsi" w:hAnsiTheme="majorHAnsi" w:eastAsiaTheme="majorEastAsia" w:cstheme="majorBidi"/>
+      <w:rFonts w:asciiTheme="majorHAnsi" w:eastAsiaTheme="majorEastAsia" w:hAnsiTheme="majorHAnsi" w:cstheme="majorBidi"/>
       <w:sz w:val="44"/>
       <w:szCs w:val="32"/>
     </w:rPr>
   </w:style>
-  <w:style w:type="character" w:styleId="Heading3Char" w:customStyle="1">
+  <w:style w:type="character" w:customStyle="1" w:styleId="Heading3Char">
     <w:name w:val="Heading 3 Char"/>
     <w:basedOn w:val="DefaultParagraphFont"/>
     <w:link w:val="Heading3"/>
@@ -1868,7 +2215,7 @@
       <w:szCs w:val="28"/>
     </w:rPr>
   </w:style>
-  <w:style w:type="character" w:styleId="Heading4Char" w:customStyle="1">
+  <w:style w:type="character" w:customStyle="1" w:styleId="Heading4Char">
     <w:name w:val="Heading 4 Char"/>
     <w:basedOn w:val="DefaultParagraphFont"/>
     <w:link w:val="Heading4"/>
@@ -1882,7 +2229,7 @@
       <w:color w:val="0F4761" w:themeColor="accent1" w:themeShade="BF"/>
     </w:rPr>
   </w:style>
-  <w:style w:type="character" w:styleId="Heading5Char" w:customStyle="1">
+  <w:style w:type="character" w:customStyle="1" w:styleId="Heading5Char">
     <w:name w:val="Heading 5 Char"/>
     <w:basedOn w:val="DefaultParagraphFont"/>
     <w:link w:val="Heading5"/>
@@ -1894,7 +2241,7 @@
       <w:color w:val="0F4761" w:themeColor="accent1" w:themeShade="BF"/>
     </w:rPr>
   </w:style>
-  <w:style w:type="character" w:styleId="Heading6Char" w:customStyle="1">
+  <w:style w:type="character" w:customStyle="1" w:styleId="Heading6Char">
     <w:name w:val="Heading 6 Char"/>
     <w:basedOn w:val="DefaultParagraphFont"/>
     <w:link w:val="Heading6"/>
@@ -1908,7 +2255,7 @@
       <w:color w:val="595959" w:themeColor="text1" w:themeTint="A6"/>
     </w:rPr>
   </w:style>
-  <w:style w:type="character" w:styleId="Heading7Char" w:customStyle="1">
+  <w:style w:type="character" w:customStyle="1" w:styleId="Heading7Char">
     <w:name w:val="Heading 7 Char"/>
     <w:basedOn w:val="DefaultParagraphFont"/>
     <w:link w:val="Heading7"/>
@@ -1920,7 +2267,7 @@
       <w:color w:val="595959" w:themeColor="text1" w:themeTint="A6"/>
     </w:rPr>
   </w:style>
-  <w:style w:type="character" w:styleId="Heading8Char" w:customStyle="1">
+  <w:style w:type="character" w:customStyle="1" w:styleId="Heading8Char">
     <w:name w:val="Heading 8 Char"/>
     <w:basedOn w:val="DefaultParagraphFont"/>
     <w:link w:val="Heading8"/>
@@ -1934,7 +2281,7 @@
       <w:color w:val="272727" w:themeColor="text1" w:themeTint="D8"/>
     </w:rPr>
   </w:style>
-  <w:style w:type="character" w:styleId="Heading9Char" w:customStyle="1">
+  <w:style w:type="character" w:customStyle="1" w:styleId="Heading9Char">
     <w:name w:val="Heading 9 Char"/>
     <w:basedOn w:val="DefaultParagraphFont"/>
     <w:link w:val="Heading9"/>
@@ -1947,31 +2294,31 @@
     </w:rPr>
   </w:style>
   <w:style w:type="paragraph" w:styleId="Title">
-    <w:uiPriority w:val="10"/>
     <w:name w:val="Title"/>
     <w:basedOn w:val="Normal"/>
     <w:next w:val="Normal"/>
     <w:link w:val="TitleChar"/>
+    <w:uiPriority w:val="10"/>
     <w:qFormat/>
     <w:rsid w:val="2DE20F6E"/>
-    <w:rPr>
-      <w:rFonts w:ascii="Aptos Display" w:hAnsi="Aptos Display" w:eastAsia="" w:cs="Times New Roman" w:asciiTheme="majorAscii" w:hAnsiTheme="majorAscii" w:eastAsiaTheme="majorEastAsia" w:cstheme="majorBidi"/>
-      <w:sz w:val="56"/>
-      <w:szCs w:val="56"/>
-    </w:rPr>
     <w:pPr>
       <w:spacing w:after="80" w:line="240" w:lineRule="auto"/>
       <w:contextualSpacing/>
     </w:pPr>
-  </w:style>
-  <w:style w:type="character" w:styleId="TitleChar" w:customStyle="1">
+    <w:rPr>
+      <w:rFonts w:asciiTheme="majorHAnsi" w:eastAsiaTheme="majorEastAsia" w:hAnsiTheme="majorHAnsi" w:cstheme="majorBidi"/>
+      <w:sz w:val="56"/>
+      <w:szCs w:val="56"/>
+    </w:rPr>
+  </w:style>
+  <w:style w:type="character" w:customStyle="1" w:styleId="TitleChar">
     <w:name w:val="Title Char"/>
     <w:basedOn w:val="DefaultParagraphFont"/>
     <w:link w:val="Title"/>
     <w:uiPriority w:val="10"/>
     <w:rsid w:val="00FF550E"/>
     <w:rPr>
-      <w:rFonts w:asciiTheme="majorHAnsi" w:hAnsiTheme="majorHAnsi" w:eastAsiaTheme="majorEastAsia" w:cstheme="majorBidi"/>
+      <w:rFonts w:asciiTheme="majorHAnsi" w:eastAsiaTheme="majorEastAsia" w:hAnsiTheme="majorHAnsi" w:cstheme="majorBidi"/>
       <w:spacing w:val="-10"/>
       <w:kern w:val="28"/>
       <w:sz w:val="56"/>
@@ -1979,21 +2326,21 @@
     </w:rPr>
   </w:style>
   <w:style w:type="paragraph" w:styleId="Subtitle">
-    <w:uiPriority w:val="11"/>
     <w:name w:val="Subtitle"/>
     <w:basedOn w:val="Normal"/>
     <w:next w:val="Normal"/>
     <w:link w:val="SubtitleChar"/>
+    <w:uiPriority w:val="11"/>
     <w:qFormat/>
     <w:rsid w:val="2DE20F6E"/>
     <w:rPr>
-      <w:rFonts w:eastAsia="" w:cs="Times New Roman" w:eastAsiaTheme="majorEastAsia" w:cstheme="majorBidi"/>
-      <w:color w:val="595959" w:themeColor="text1" w:themeTint="A6" w:themeShade="FF"/>
+      <w:rFonts w:eastAsiaTheme="majorEastAsia" w:cstheme="majorBidi"/>
+      <w:color w:val="595959" w:themeColor="text1" w:themeTint="A6"/>
       <w:sz w:val="28"/>
       <w:szCs w:val="28"/>
     </w:rPr>
   </w:style>
-  <w:style w:type="character" w:styleId="SubtitleChar" w:customStyle="1">
+  <w:style w:type="character" w:customStyle="1" w:styleId="SubtitleChar">
     <w:name w:val="Subtitle Char"/>
     <w:basedOn w:val="DefaultParagraphFont"/>
     <w:link w:val="Subtitle"/>
@@ -2008,24 +2355,24 @@
     </w:rPr>
   </w:style>
   <w:style w:type="paragraph" w:styleId="Quote">
-    <w:uiPriority w:val="29"/>
     <w:name w:val="Quote"/>
     <w:basedOn w:val="Normal"/>
     <w:next w:val="Normal"/>
     <w:link w:val="QuoteChar"/>
+    <w:uiPriority w:val="29"/>
     <w:qFormat/>
     <w:rsid w:val="2DE20F6E"/>
-    <w:rPr>
-      <w:i w:val="1"/>
-      <w:iCs w:val="1"/>
-      <w:color w:val="404040" w:themeColor="text1" w:themeTint="BF" w:themeShade="FF"/>
-    </w:rPr>
     <w:pPr>
       <w:spacing w:before="160"/>
       <w:jc w:val="center"/>
     </w:pPr>
-  </w:style>
-  <w:style w:type="character" w:styleId="QuoteChar" w:customStyle="1">
+    <w:rPr>
+      <w:i/>
+      <w:iCs/>
+      <w:color w:val="404040" w:themeColor="text1" w:themeTint="BF"/>
+    </w:rPr>
+  </w:style>
+  <w:style w:type="character" w:customStyle="1" w:styleId="QuoteChar">
     <w:name w:val="Quote Char"/>
     <w:basedOn w:val="DefaultParagraphFont"/>
     <w:link w:val="Quote"/>
@@ -2038,13 +2385,12 @@
     </w:rPr>
   </w:style>
   <w:style w:type="paragraph" w:styleId="ListParagraph">
-    <w:uiPriority w:val="34"/>
     <w:name w:val="List Paragraph"/>
     <w:basedOn w:val="Normal"/>
+    <w:uiPriority w:val="34"/>
     <w:qFormat/>
     <w:rsid w:val="2DE20F6E"/>
     <w:pPr>
-      <w:spacing/>
       <w:ind w:left="720"/>
       <w:contextualSpacing/>
     </w:pPr>
@@ -2062,29 +2408,29 @@
     </w:rPr>
   </w:style>
   <w:style w:type="paragraph" w:styleId="IntenseQuote">
-    <w:uiPriority w:val="30"/>
     <w:name w:val="Intense Quote"/>
     <w:basedOn w:val="Normal"/>
     <w:next w:val="Normal"/>
     <w:link w:val="IntenseQuoteChar"/>
+    <w:uiPriority w:val="30"/>
     <w:qFormat/>
     <w:rsid w:val="2DE20F6E"/>
-    <w:rPr>
-      <w:i w:val="1"/>
-      <w:iCs w:val="1"/>
-      <w:color w:val="0F4761" w:themeColor="accent1" w:themeTint="FF" w:themeShade="BF"/>
-    </w:rPr>
     <w:pPr>
       <w:pBdr>
-        <w:top w:val="single" w:color="0F4761" w:themeColor="accent1" w:themeShade="BF" w:sz="4" w:space="10"/>
-        <w:bottom w:val="single" w:color="0F4761" w:themeColor="accent1" w:themeShade="BF" w:sz="4" w:space="10"/>
+        <w:top w:val="single" w:sz="4" w:space="10" w:color="0F4761" w:themeColor="accent1" w:themeShade="BF"/>
+        <w:bottom w:val="single" w:sz="4" w:space="10" w:color="0F4761" w:themeColor="accent1" w:themeShade="BF"/>
       </w:pBdr>
       <w:spacing w:before="360" w:after="360"/>
       <w:ind w:left="864" w:right="864"/>
       <w:jc w:val="center"/>
     </w:pPr>
-  </w:style>
-  <w:style w:type="character" w:styleId="IntenseQuoteChar" w:customStyle="1">
+    <w:rPr>
+      <w:i/>
+      <w:iCs/>
+      <w:color w:val="0F4761" w:themeColor="accent1" w:themeShade="BF"/>
+    </w:rPr>
+  </w:style>
+  <w:style w:type="character" w:customStyle="1" w:styleId="IntenseQuoteChar">
     <w:name w:val="Intense Quote Char"/>
     <w:basedOn w:val="DefaultParagraphFont"/>
     <w:link w:val="IntenseQuote"/>
@@ -2134,40 +2480,59 @@
     </w:rPr>
   </w:style>
   <w:style w:type="paragraph" w:styleId="FootnoteText">
-    <w:uiPriority w:val="99"/>
     <w:name w:val="footnote text"/>
     <w:basedOn w:val="Normal"/>
+    <w:uiPriority w:val="99"/>
     <w:semiHidden/>
     <w:unhideWhenUsed/>
     <w:rsid w:val="2DE20F6E"/>
-    <w:rPr>
-      <w:sz w:val="20"/>
-      <w:szCs w:val="20"/>
-    </w:rPr>
     <w:pPr>
       <w:spacing w:after="0" w:line="240" w:lineRule="auto"/>
     </w:pPr>
+    <w:rPr>
+      <w:sz w:val="20"/>
+      <w:szCs w:val="20"/>
+    </w:rPr>
   </w:style>
   <w:style w:type="paragraph" w:styleId="EndnoteText">
-    <w:uiPriority w:val="99"/>
     <w:name w:val="endnote text"/>
     <w:basedOn w:val="Normal"/>
+    <w:uiPriority w:val="99"/>
     <w:semiHidden/>
     <w:unhideWhenUsed/>
     <w:rsid w:val="2DE20F6E"/>
-    <w:rPr>
-      <w:sz w:val="20"/>
-      <w:szCs w:val="20"/>
-    </w:rPr>
     <w:pPr>
       <w:spacing w:after="0" w:line="240" w:lineRule="auto"/>
     </w:pPr>
+    <w:rPr>
+      <w:sz w:val="20"/>
+      <w:szCs w:val="20"/>
+    </w:rPr>
+  </w:style>
+  <w:style w:type="paragraph" w:styleId="Caption">
+    <w:name w:val="caption"/>
+    <w:basedOn w:val="Normal"/>
+    <w:next w:val="Normal"/>
+    <w:uiPriority w:val="35"/>
+    <w:unhideWhenUsed/>
+    <w:qFormat/>
+    <w:rsid w:val="009E3565"/>
+    <w:pPr>
+      <w:spacing w:after="200" w:line="240" w:lineRule="auto"/>
+    </w:pPr>
+    <w:rPr>
+      <w:i/>
+      <w:iCs/>
+      <w:color w:val="0E2841" w:themeColor="text2"/>
+      <w:sz w:val="18"/>
+      <w:szCs w:val="18"/>
+    </w:rPr>
   </w:style>
 </w:styles>
 </file>
 
 <file path=word/theme/theme1.xml><?xml version="1.0" encoding="utf-8"?>
-<a:theme xmlns:a="http://schemas.openxmlformats.org/drawingml/2006/main" xmlns:thm15="http://schemas.microsoft.com/office/thememl/2012/main" name="Office Theme">
+<a:theme xmlns:a="http://schemas.openxmlformats.org/drawingml/2006/main" name="Office Theme">
   <a:themeElements>
     <a:clrScheme name="Office">
       <a:dk1>

</xml_diff>